<commit_message>
scribe: continuous handout flow to fix mid-document gap
Drop the hard page break from the template (divider instead) and render
docx-preview in continuous mode so the browser paginates naturally —
removes the partial blank between docx sections.

Co-Authored-By: Claude Opus 4.7 <noreply@anthropic.com>
</commit_message>
<xml_diff>
--- a/backend/assets/Handout_Template.docx
+++ b/backend/assets/Handout_Template.docx
@@ -403,9 +403,12 @@
       </w:r>
     </w:p>
     <w:p>
-      <w:r>
-        <w:br w:type="page"/>
-      </w:r>
+      <w:pPr>
+        <w:pBdr>
+          <w:bottom w:val="single" w:color="46C1C0" w:sz="12"/>
+        </w:pBdr>
+        <w:spacing w:after="160" w:before="160"/>
+      </w:pPr>
     </w:p>
     <w:p>
       <w:pPr>

</xml_diff>

<commit_message>
scribe: keep handout pricing tiers/headings together across pages
Set keepNext on headings/tier names and keepLines on body paragraphs in the
template; add a paragraph break-inside backstop in print CSS. Stops a pricing
tier splitting across a page boundary.

Co-Authored-By: Claude Opus 4.7 <noreply@anthropic.com>
</commit_message>
<xml_diff>
--- a/backend/assets/Handout_Template.docx
+++ b/backend/assets/Handout_Template.docx
@@ -127,6 +127,7 @@
     </w:p>
     <w:p>
       <w:pPr>
+        <w:keepNext/>
         <w:spacing w:after="100" w:before="160"/>
       </w:pPr>
       <w:r>
@@ -158,6 +159,7 @@
     </w:p>
     <w:p>
       <w:pPr>
+        <w:keepNext/>
         <w:spacing w:after="60" w:before="120"/>
       </w:pPr>
       <w:r>
@@ -373,6 +375,7 @@
     </w:tbl>
     <w:p>
       <w:pPr>
+        <w:keepNext/>
         <w:spacing w:after="100" w:before="160"/>
       </w:pPr>
       <w:r>
@@ -412,6 +415,7 @@
     </w:p>
     <w:p>
       <w:pPr>
+        <w:keepNext/>
         <w:spacing w:after="100" w:before="160"/>
       </w:pPr>
       <w:r>
@@ -429,6 +433,7 @@
     </w:p>
     <w:p>
       <w:pPr>
+        <w:keepNext/>
         <w:spacing w:after="60" w:before="120"/>
       </w:pPr>
       <w:r>
@@ -446,6 +451,7 @@
     </w:p>
     <w:p>
       <w:pPr>
+        <w:keepLines/>
         <w:spacing w:after="100"/>
       </w:pPr>
       <w:r>
@@ -460,6 +466,8 @@
     </w:p>
     <w:p>
       <w:pPr>
+        <w:keepNext/>
+        <w:keepLines/>
         <w:spacing w:after="30" w:before="100"/>
       </w:pPr>
       <w:r>
@@ -476,6 +484,7 @@
     </w:p>
     <w:p>
       <w:pPr>
+        <w:keepLines/>
         <w:spacing w:after="100"/>
       </w:pPr>
       <w:r>
@@ -490,6 +499,8 @@
     </w:p>
     <w:p>
       <w:pPr>
+        <w:keepNext/>
+        <w:keepLines/>
         <w:spacing w:after="30" w:before="100"/>
       </w:pPr>
       <w:r>
@@ -506,6 +517,7 @@
     </w:p>
     <w:p>
       <w:pPr>
+        <w:keepLines/>
         <w:spacing w:after="100"/>
       </w:pPr>
       <w:r>
@@ -520,6 +532,8 @@
     </w:p>
     <w:p>
       <w:pPr>
+        <w:keepNext/>
+        <w:keepLines/>
         <w:spacing w:after="30" w:before="100"/>
       </w:pPr>
       <w:r>
@@ -536,6 +550,7 @@
     </w:p>
     <w:p>
       <w:pPr>
+        <w:keepLines/>
         <w:spacing w:after="100"/>
       </w:pPr>
       <w:r>
@@ -550,6 +565,7 @@
     </w:p>
     <w:p>
       <w:pPr>
+        <w:keepNext/>
         <w:spacing w:after="60" w:before="120"/>
       </w:pPr>
       <w:r>
@@ -567,6 +583,7 @@
     </w:p>
     <w:p>
       <w:pPr>
+        <w:keepLines/>
         <w:spacing w:after="100"/>
       </w:pPr>
       <w:r>
@@ -1129,6 +1146,7 @@
     </w:tbl>
     <w:p>
       <w:pPr>
+        <w:keepLines/>
         <w:spacing w:after="100"/>
       </w:pPr>
       <w:r>
@@ -1143,6 +1161,7 @@
     </w:p>
     <w:p>
       <w:pPr>
+        <w:keepNext/>
         <w:spacing w:after="100" w:before="160"/>
       </w:pPr>
       <w:r>
@@ -1160,6 +1179,7 @@
     </w:p>
     <w:p>
       <w:pPr>
+        <w:keepNext/>
         <w:spacing w:after="60" w:before="120"/>
       </w:pPr>
       <w:r>
@@ -1177,6 +1197,7 @@
     </w:p>
     <w:p>
       <w:pPr>
+        <w:keepLines/>
         <w:spacing w:after="100"/>
       </w:pPr>
       <w:r>
@@ -1191,6 +1212,7 @@
     </w:p>
     <w:p>
       <w:pPr>
+        <w:keepNext/>
         <w:spacing w:after="60" w:before="120"/>
       </w:pPr>
       <w:r>
@@ -1208,6 +1230,7 @@
     </w:p>
     <w:p>
       <w:pPr>
+        <w:keepLines/>
         <w:spacing w:after="100"/>
       </w:pPr>
       <w:r>
@@ -1222,6 +1245,7 @@
     </w:p>
     <w:p>
       <w:pPr>
+        <w:keepNext/>
         <w:spacing w:after="100" w:before="160"/>
       </w:pPr>
       <w:r>
@@ -1239,6 +1263,7 @@
     </w:p>
     <w:p>
       <w:pPr>
+        <w:keepLines/>
         <w:spacing w:after="100"/>
       </w:pPr>
       <w:r>
@@ -1253,6 +1278,7 @@
     </w:p>
     <w:p>
       <w:pPr>
+        <w:keepLines/>
         <w:spacing w:after="100"/>
       </w:pPr>
       <w:r>
@@ -1267,6 +1293,7 @@
     </w:p>
     <w:p>
       <w:pPr>
+        <w:keepLines/>
         <w:spacing w:after="100"/>
       </w:pPr>
       <w:r>

</xml_diff>

<commit_message>
scribe: page break before Section 3 in handout template
Use the page-break-before paragraph property on the Section 3 heading so
the pricing/options always start on a fresh page (clean in continuous-render
mode, no double-section gap). Replaces the divider.

Co-Authored-By: Claude Opus 4.7 <noreply@anthropic.com>
</commit_message>
<xml_diff>
--- a/backend/assets/Handout_Template.docx
+++ b/backend/assets/Handout_Template.docx
@@ -407,15 +407,8 @@
     </w:p>
     <w:p>
       <w:pPr>
-        <w:pBdr>
-          <w:bottom w:val="single" w:color="46C1C0" w:sz="12"/>
-        </w:pBdr>
-        <w:spacing w:after="160" w:before="160"/>
-      </w:pPr>
-    </w:p>
-    <w:p>
-      <w:pPr>
         <w:keepNext/>
+        <w:pageBreakBefore/>
         <w:spacing w:after="100" w:before="160"/>
       </w:pPr>
       <w:r>

</xml_diff>

<commit_message>
scribe: split handout into 4 pages + add results explainer
- page break before section 5 (assessment results) with its own banner
- new "What Your Results Mean" explainer after the results table
- page break before Casual Options so casual/rebates stay together
- bump body, section, and table text sizes to fill the new space

Co-Authored-By: Claude Opus 4.7 <noreply@anthropic.com>
</commit_message>
<xml_diff>
--- a/backend/assets/Handout_Template.docx
+++ b/backend/assets/Handout_Template.docx
@@ -365,7 +365,7 @@
           </w:tcPr>
           <w:p>
             <w:pPr>
-              <w:spacing w:after="80"/>
+              <w:spacing w:after="100"/>
             </w:pPr>
             <w:r>
               <w:rPr>
@@ -375,8 +375,8 @@
                 <w:caps/>
                 <w:color w:val="132232"/>
                 <w:spacing w:val="16"/>
-                <w:sz w:val="26"/>
-                <w:szCs w:val="26"/>
+                <w:sz w:val="28"/>
+                <w:szCs w:val="28"/>
               </w:rPr>
               <w:t xml:space="preserve">WHAT'S GOING ON</w:t>
             </w:r>
@@ -389,8 +389,8 @@
               <w:rPr>
                 <w:rFonts w:ascii="Manrope" w:cs="Manrope" w:eastAsia="Manrope" w:hAnsi="Manrope"/>
                 <w:color w:val="1A2230"/>
-                <w:sz w:val="21"/>
-                <w:szCs w:val="21"/>
+                <w:sz w:val="23"/>
+                <w:szCs w:val="23"/>
               </w:rPr>
               <w:t xml:space="preserve">{{whats_going_on}}</w:t>
             </w:r>
@@ -464,7 +464,7 @@
           </w:tcPr>
           <w:p>
             <w:pPr>
-              <w:spacing w:after="80"/>
+              <w:spacing w:after="100"/>
             </w:pPr>
             <w:r>
               <w:rPr>
@@ -474,8 +474,8 @@
                 <w:caps/>
                 <w:color w:val="132232"/>
                 <w:spacing w:val="16"/>
-                <w:sz w:val="26"/>
-                <w:szCs w:val="26"/>
+                <w:sz w:val="28"/>
+                <w:szCs w:val="28"/>
               </w:rPr>
               <w:t xml:space="preserve">WHAT WE'RE AIMING FOR</w:t>
             </w:r>
@@ -488,8 +488,8 @@
               <w:rPr>
                 <w:rFonts w:ascii="Manrope" w:cs="Manrope" w:eastAsia="Manrope" w:hAnsi="Manrope"/>
                 <w:color w:val="1A2230"/>
-                <w:sz w:val="21"/>
-                <w:szCs w:val="21"/>
+                <w:sz w:val="23"/>
+                <w:szCs w:val="23"/>
               </w:rPr>
               <w:t xml:space="preserve">{{our_aims}}</w:t>
             </w:r>
@@ -563,7 +563,7 @@
           </w:tcPr>
           <w:p>
             <w:pPr>
-              <w:spacing w:after="80"/>
+              <w:spacing w:after="100"/>
             </w:pPr>
             <w:r>
               <w:rPr>
@@ -573,8 +573,8 @@
                 <w:caps/>
                 <w:color w:val="132232"/>
                 <w:spacing w:val="16"/>
-                <w:sz w:val="26"/>
-                <w:szCs w:val="26"/>
+                <w:sz w:val="28"/>
+                <w:szCs w:val="28"/>
               </w:rPr>
               <w:t xml:space="preserve">HOW WE'LL GET THERE</w:t>
             </w:r>
@@ -587,8 +587,8 @@
               <w:rPr>
                 <w:rFonts w:ascii="Manrope" w:cs="Manrope" w:eastAsia="Manrope" w:hAnsi="Manrope"/>
                 <w:color w:val="1A2230"/>
-                <w:sz w:val="21"/>
-                <w:szCs w:val="21"/>
+                <w:sz w:val="23"/>
+                <w:szCs w:val="23"/>
               </w:rPr>
               <w:t xml:space="preserve">{{how_we_get_there}}</w:t>
             </w:r>
@@ -599,7 +599,7 @@
               <w:pBdr>
                 <w:top w:val="single" w:color="46C1C0" w:sz="16"/>
               </w:pBdr>
-              <w:spacing w:before="120"/>
+              <w:spacing w:before="140"/>
             </w:pPr>
             <w:r>
               <w:rPr>
@@ -607,8 +607,8 @@
                 <w:b/>
                 <w:bCs/>
                 <w:color w:val="045E62"/>
-                <w:sz w:val="20"/>
-                <w:szCs w:val="20"/>
+                <w:sz w:val="21"/>
+                <w:szCs w:val="21"/>
               </w:rPr>
               <w:t xml:space="preserve">↘ 1:1 support is flexible. See Your Options.</w:t>
             </w:r>
@@ -682,7 +682,7 @@
           </w:tcPr>
           <w:p>
             <w:pPr>
-              <w:spacing w:after="80"/>
+              <w:spacing w:after="100"/>
             </w:pPr>
             <w:r>
               <w:rPr>
@@ -692,8 +692,8 @@
                 <w:caps/>
                 <w:color w:val="132232"/>
                 <w:spacing w:val="16"/>
-                <w:sz w:val="26"/>
-                <w:szCs w:val="26"/>
+                <w:sz w:val="28"/>
+                <w:szCs w:val="28"/>
               </w:rPr>
               <w:t xml:space="preserve">WHAT YOU CAN EXPECT</w:t>
             </w:r>
@@ -706,303 +706,10 @@
               <w:rPr>
                 <w:rFonts w:ascii="Manrope" w:cs="Manrope" w:eastAsia="Manrope" w:hAnsi="Manrope"/>
                 <w:color w:val="1A2230"/>
-                <w:sz w:val="21"/>
-                <w:szCs w:val="21"/>
+                <w:sz w:val="23"/>
+                <w:szCs w:val="23"/>
               </w:rPr>
               <w:t xml:space="preserve">{{what_to_expect}}</w:t>
-            </w:r>
-          </w:p>
-        </w:tc>
-      </w:tr>
-    </w:tbl>
-    <w:tbl>
-      <w:tblPr>
-        <w:tblW w:type="pct" w:w="100%"/>
-        <w:tblBorders>
-          <w:top w:val="none" w:color="FFFFFF" w:sz="0"/>
-          <w:left w:val="none" w:color="FFFFFF" w:sz="0"/>
-          <w:bottom w:val="none" w:color="FFFFFF" w:sz="0"/>
-          <w:right w:val="none" w:color="FFFFFF" w:sz="0"/>
-          <w:insideH w:val="single" w:color="auto" w:sz="4"/>
-          <w:insideV w:val="single" w:color="auto" w:sz="4"/>
-        </w:tblBorders>
-      </w:tblPr>
-      <w:tblGrid>
-        <w:gridCol w:w="1100"/>
-        <w:gridCol w:w="8500"/>
-      </w:tblGrid>
-      <w:tr>
-        <w:trPr>
-          <w:cantSplit/>
-        </w:trPr>
-        <w:tc>
-          <w:tcPr>
-            <w:tcBorders>
-              <w:top w:val="none" w:color="FFFFFF" w:sz="0"/>
-              <w:left w:val="none" w:color="FFFFFF" w:sz="0"/>
-              <w:bottom w:val="none" w:color="FFFFFF" w:sz="0"/>
-              <w:right w:val="none" w:color="FFFFFF" w:sz="0"/>
-            </w:tcBorders>
-            <w:tcMar>
-              <w:top w:type="dxa" w:w="80"/>
-              <w:left w:type="dxa" w:w="0"/>
-              <w:bottom w:type="dxa" w:w="240"/>
-              <w:right w:type="dxa" w:w="200"/>
-            </w:tcMar>
-          </w:tcPr>
-          <w:p>
-            <w:r>
-              <w:rPr>
-                <w:rFonts w:ascii="Manrope" w:cs="Manrope" w:eastAsia="Manrope" w:hAnsi="Manrope"/>
-                <w:b/>
-                <w:bCs/>
-                <w:color w:val="46C1C0"/>
-                <w:sz w:val="64"/>
-                <w:szCs w:val="64"/>
-              </w:rPr>
-              <w:t xml:space="preserve">5</w:t>
-            </w:r>
-          </w:p>
-        </w:tc>
-        <w:tc>
-          <w:tcPr>
-            <w:tcBorders>
-              <w:top w:val="none" w:color="FFFFFF" w:sz="0"/>
-              <w:left w:val="none" w:color="FFFFFF" w:sz="0"/>
-              <w:bottom w:val="none" w:color="FFFFFF" w:sz="0"/>
-              <w:right w:val="none" w:color="FFFFFF" w:sz="0"/>
-            </w:tcBorders>
-            <w:tcMar>
-              <w:top w:type="dxa" w:w="80"/>
-              <w:left w:type="dxa" w:w="0"/>
-              <w:bottom w:type="dxa" w:w="240"/>
-              <w:right w:type="dxa" w:w="0"/>
-            </w:tcMar>
-          </w:tcPr>
-          <w:p>
-            <w:pPr>
-              <w:spacing w:after="80"/>
-            </w:pPr>
-            <w:r>
-              <w:rPr>
-                <w:rFonts w:ascii="Manrope" w:cs="Manrope" w:eastAsia="Manrope" w:hAnsi="Manrope"/>
-                <w:b/>
-                <w:bCs/>
-                <w:caps/>
-                <w:color w:val="132232"/>
-                <w:spacing w:val="16"/>
-                <w:sz w:val="26"/>
-                <w:szCs w:val="26"/>
-              </w:rPr>
-              <w:t xml:space="preserve">YOUR ASSESSMENT RESULTS</w:t>
-            </w:r>
-          </w:p>
-        </w:tc>
-      </w:tr>
-    </w:tbl>
-    <w:tbl>
-      <w:tblPr>
-        <w:tblW w:type="pct" w:w="100%"/>
-        <w:tblBorders>
-          <w:top w:val="none" w:color="FFFFFF" w:sz="0"/>
-          <w:left w:val="none" w:color="FFFFFF" w:sz="0"/>
-          <w:bottom w:val="none" w:color="FFFFFF" w:sz="0"/>
-          <w:right w:val="none" w:color="FFFFFF" w:sz="0"/>
-          <w:insideH w:val="single" w:color="auto" w:sz="4"/>
-          <w:insideV w:val="single" w:color="auto" w:sz="4"/>
-        </w:tblBorders>
-      </w:tblPr>
-      <w:tblGrid>
-        <w:gridCol w:w="3100"/>
-        <w:gridCol w:w="2100"/>
-        <w:gridCol w:w="4400"/>
-      </w:tblGrid>
-      <w:tr>
-        <w:trPr>
-          <w:tblHeader/>
-        </w:trPr>
-        <w:tc>
-          <w:tcPr>
-            <w:tcW w:type="pct" w:w="32%"/>
-            <w:tcBorders>
-              <w:top w:val="none" w:color="FFFFFF" w:sz="0"/>
-              <w:left w:val="none" w:color="FFFFFF" w:sz="0"/>
-              <w:bottom w:val="none" w:color="FFFFFF" w:sz="0"/>
-              <w:right w:val="none" w:color="FFFFFF" w:sz="0"/>
-            </w:tcBorders>
-            <w:shd w:fill="132232" w:color="auto" w:val="clear"/>
-            <w:tcMar>
-              <w:top w:type="dxa" w:w="120"/>
-              <w:left w:type="dxa" w:w="200"/>
-              <w:bottom w:type="dxa" w:w="120"/>
-              <w:right w:type="dxa" w:w="200"/>
-            </w:tcMar>
-          </w:tcPr>
-          <w:p>
-            <w:r>
-              <w:rPr>
-                <w:rFonts w:ascii="Manrope" w:cs="Manrope" w:eastAsia="Manrope" w:hAnsi="Manrope"/>
-                <w:b/>
-                <w:bCs/>
-                <w:caps/>
-                <w:color w:val="FFFFFF"/>
-                <w:spacing w:val="24"/>
-                <w:sz w:val="17"/>
-                <w:szCs w:val="17"/>
-              </w:rPr>
-              <w:t xml:space="preserve">TEST</w:t>
-            </w:r>
-          </w:p>
-        </w:tc>
-        <w:tc>
-          <w:tcPr>
-            <w:tcW w:type="pct" w:w="22%"/>
-            <w:tcBorders>
-              <w:top w:val="none" w:color="FFFFFF" w:sz="0"/>
-              <w:left w:val="none" w:color="FFFFFF" w:sz="0"/>
-              <w:bottom w:val="none" w:color="FFFFFF" w:sz="0"/>
-              <w:right w:val="none" w:color="FFFFFF" w:sz="0"/>
-            </w:tcBorders>
-            <w:shd w:fill="132232" w:color="auto" w:val="clear"/>
-            <w:tcMar>
-              <w:top w:type="dxa" w:w="120"/>
-              <w:left w:type="dxa" w:w="200"/>
-              <w:bottom w:type="dxa" w:w="120"/>
-              <w:right w:type="dxa" w:w="200"/>
-            </w:tcMar>
-          </w:tcPr>
-          <w:p>
-            <w:r>
-              <w:rPr>
-                <w:rFonts w:ascii="Manrope" w:cs="Manrope" w:eastAsia="Manrope" w:hAnsi="Manrope"/>
-                <w:b/>
-                <w:bCs/>
-                <w:caps/>
-                <w:color w:val="FFFFFF"/>
-                <w:spacing w:val="24"/>
-                <w:sz w:val="17"/>
-                <w:szCs w:val="17"/>
-              </w:rPr>
-              <w:t xml:space="preserve">RESULT</w:t>
-            </w:r>
-          </w:p>
-        </w:tc>
-        <w:tc>
-          <w:tcPr>
-            <w:tcBorders>
-              <w:top w:val="none" w:color="FFFFFF" w:sz="0"/>
-              <w:left w:val="none" w:color="FFFFFF" w:sz="0"/>
-              <w:bottom w:val="none" w:color="FFFFFF" w:sz="0"/>
-              <w:right w:val="none" w:color="FFFFFF" w:sz="0"/>
-            </w:tcBorders>
-            <w:shd w:fill="132232" w:color="auto" w:val="clear"/>
-            <w:tcMar>
-              <w:top w:type="dxa" w:w="120"/>
-              <w:left w:type="dxa" w:w="200"/>
-              <w:bottom w:type="dxa" w:w="120"/>
-              <w:right w:type="dxa" w:w="200"/>
-            </w:tcMar>
-          </w:tcPr>
-          <w:p>
-            <w:r>
-              <w:rPr>
-                <w:rFonts w:ascii="Manrope" w:cs="Manrope" w:eastAsia="Manrope" w:hAnsi="Manrope"/>
-                <w:b/>
-                <w:bCs/>
-                <w:caps/>
-                <w:color w:val="FFFFFF"/>
-                <w:spacing w:val="24"/>
-                <w:sz w:val="17"/>
-                <w:szCs w:val="17"/>
-              </w:rPr>
-              <w:t xml:space="preserve">INTERPRETATION</w:t>
-            </w:r>
-          </w:p>
-        </w:tc>
-      </w:tr>
-      <w:tr>
-        <w:tc>
-          <w:tcPr>
-            <w:tcBorders>
-              <w:top w:val="none" w:color="FFFFFF" w:sz="0"/>
-              <w:left w:val="none" w:color="FFFFFF" w:sz="0"/>
-              <w:bottom w:val="single" w:color="E2E8F0" w:sz="4"/>
-              <w:right w:val="none" w:color="FFFFFF" w:sz="0"/>
-            </w:tcBorders>
-            <w:tcMar>
-              <w:top w:type="dxa" w:w="140"/>
-              <w:left w:type="dxa" w:w="200"/>
-              <w:bottom w:type="dxa" w:w="140"/>
-              <w:right w:type="dxa" w:w="200"/>
-            </w:tcMar>
-          </w:tcPr>
-          <w:p>
-            <w:r>
-              <w:rPr>
-                <w:rFonts w:ascii="Manrope" w:cs="Manrope" w:eastAsia="Manrope" w:hAnsi="Manrope"/>
-                <w:b/>
-                <w:bCs/>
-                <w:color w:val="132232"/>
-                <w:sz w:val="20"/>
-                <w:szCs w:val="20"/>
-              </w:rPr>
-              <w:t xml:space="preserve">{{#assessment_rows}}{{test}}</w:t>
-            </w:r>
-          </w:p>
-        </w:tc>
-        <w:tc>
-          <w:tcPr>
-            <w:tcBorders>
-              <w:top w:val="none" w:color="FFFFFF" w:sz="0"/>
-              <w:left w:val="none" w:color="FFFFFF" w:sz="0"/>
-              <w:bottom w:val="single" w:color="E2E8F0" w:sz="4"/>
-              <w:right w:val="none" w:color="FFFFFF" w:sz="0"/>
-            </w:tcBorders>
-            <w:tcMar>
-              <w:top w:type="dxa" w:w="140"/>
-              <w:left w:type="dxa" w:w="200"/>
-              <w:bottom w:type="dxa" w:w="140"/>
-              <w:right w:type="dxa" w:w="200"/>
-            </w:tcMar>
-          </w:tcPr>
-          <w:p>
-            <w:r>
-              <w:rPr>
-                <w:rFonts w:ascii="Manrope" w:cs="Manrope" w:eastAsia="Manrope" w:hAnsi="Manrope"/>
-                <w:b/>
-                <w:bCs/>
-                <w:color w:val="132232"/>
-                <w:sz w:val="20"/>
-                <w:szCs w:val="20"/>
-              </w:rPr>
-              <w:t xml:space="preserve">{{result}}</w:t>
-            </w:r>
-          </w:p>
-        </w:tc>
-        <w:tc>
-          <w:tcPr>
-            <w:tcBorders>
-              <w:top w:val="none" w:color="FFFFFF" w:sz="0"/>
-              <w:left w:val="none" w:color="FFFFFF" w:sz="0"/>
-              <w:bottom w:val="single" w:color="E2E8F0" w:sz="4"/>
-              <w:right w:val="none" w:color="FFFFFF" w:sz="0"/>
-            </w:tcBorders>
-            <w:tcMar>
-              <w:top w:type="dxa" w:w="140"/>
-              <w:left w:type="dxa" w:w="200"/>
-              <w:bottom w:type="dxa" w:w="140"/>
-              <w:right w:type="dxa" w:w="200"/>
-            </w:tcMar>
-          </w:tcPr>
-          <w:p>
-            <w:r>
-              <w:rPr>
-                <w:rFonts w:ascii="Manrope" w:cs="Manrope" w:eastAsia="Manrope" w:hAnsi="Manrope"/>
-                <w:color w:val="56606E"/>
-                <w:sz w:val="20"/>
-                <w:szCs w:val="20"/>
-              </w:rPr>
-              <w:t xml:space="preserve">{{interpretation}}{{/assessment_rows}}</w:t>
             </w:r>
           </w:p>
         </w:tc>
@@ -1227,7 +934,646 @@
                 <w:sz w:val="17"/>
                 <w:szCs w:val="17"/>
               </w:rPr>
-              <w:t xml:space="preserve">TREATMENT OPTIONS  ·  PAGE 2 OF 2</w:t>
+              <w:t xml:space="preserve">EXERCISE PHYSIOLOGY  ·  ASSESSMENT</w:t>
+            </w:r>
+          </w:p>
+          <w:p>
+            <w:pPr>
+              <w:spacing w:after="120"/>
+            </w:pPr>
+            <w:r>
+              <w:rPr>
+                <w:rFonts w:ascii="Manrope" w:cs="Manrope" w:eastAsia="Manrope" w:hAnsi="Manrope"/>
+                <w:b/>
+                <w:bCs/>
+                <w:color w:val="FFFFFF"/>
+                <w:sz w:val="52"/>
+                <w:szCs w:val="52"/>
+              </w:rPr>
+              <w:t xml:space="preserve">Understanding your </w:t>
+            </w:r>
+            <w:r>
+              <w:rPr>
+                <w:rFonts w:ascii="Manrope" w:cs="Manrope" w:eastAsia="Manrope" w:hAnsi="Manrope"/>
+                <w:b/>
+                <w:bCs/>
+                <w:color w:val="46C1C0"/>
+                <w:sz w:val="52"/>
+                <w:szCs w:val="52"/>
+              </w:rPr>
+              <w:t xml:space="preserve">results</w:t>
+            </w:r>
+            <w:r>
+              <w:rPr>
+                <w:rFonts w:ascii="Manrope" w:cs="Manrope" w:eastAsia="Manrope" w:hAnsi="Manrope"/>
+                <w:b/>
+                <w:bCs/>
+                <w:color w:val="FFFFFF"/>
+                <w:sz w:val="52"/>
+                <w:szCs w:val="52"/>
+              </w:rPr>
+              <w:t xml:space="preserve">.</w:t>
+            </w:r>
+          </w:p>
+          <w:p>
+            <w:r>
+              <w:rPr>
+                <w:rFonts w:ascii="Manrope" w:cs="Manrope" w:eastAsia="Manrope" w:hAnsi="Manrope"/>
+                <w:color w:val="E6EDF2"/>
+                <w:sz w:val="22"/>
+                <w:szCs w:val="22"/>
+              </w:rPr>
+              <w:t xml:space="preserve">Measured </w:t>
+            </w:r>
+            <w:r>
+              <w:rPr>
+                <w:rFonts w:ascii="Manrope" w:cs="Manrope" w:eastAsia="Manrope" w:hAnsi="Manrope"/>
+                <w:b/>
+                <w:bCs/>
+                <w:color w:val="FFFFFF"/>
+                <w:sz w:val="22"/>
+                <w:szCs w:val="22"/>
+              </w:rPr>
+              <w:t xml:space="preserve">{{assessment_date}}</w:t>
+            </w:r>
+          </w:p>
+        </w:tc>
+        <w:tc>
+          <w:tcPr>
+            <w:tcBorders>
+              <w:top w:val="none" w:color="FFFFFF" w:sz="0"/>
+              <w:left w:val="none" w:color="FFFFFF" w:sz="0"/>
+              <w:bottom w:val="none" w:color="FFFFFF" w:sz="0"/>
+              <w:right w:val="none" w:color="FFFFFF" w:sz="0"/>
+            </w:tcBorders>
+            <w:shd w:fill="46C1C0" w:color="auto" w:val="clear"/>
+          </w:tcPr>
+          <w:p/>
+        </w:tc>
+      </w:tr>
+    </w:tbl>
+    <w:p>
+      <w:pPr>
+        <w:spacing w:after="240"/>
+      </w:pPr>
+    </w:p>
+    <w:tbl>
+      <w:tblPr>
+        <w:tblW w:type="pct" w:w="100%"/>
+        <w:tblBorders>
+          <w:top w:val="none" w:color="FFFFFF" w:sz="0"/>
+          <w:left w:val="none" w:color="FFFFFF" w:sz="0"/>
+          <w:bottom w:val="none" w:color="FFFFFF" w:sz="0"/>
+          <w:right w:val="none" w:color="FFFFFF" w:sz="0"/>
+          <w:insideH w:val="single" w:color="auto" w:sz="4"/>
+          <w:insideV w:val="single" w:color="auto" w:sz="4"/>
+        </w:tblBorders>
+      </w:tblPr>
+      <w:tblGrid>
+        <w:gridCol w:w="1100"/>
+        <w:gridCol w:w="8500"/>
+      </w:tblGrid>
+      <w:tr>
+        <w:trPr>
+          <w:cantSplit/>
+        </w:trPr>
+        <w:tc>
+          <w:tcPr>
+            <w:tcBorders>
+              <w:top w:val="none" w:color="FFFFFF" w:sz="0"/>
+              <w:left w:val="none" w:color="FFFFFF" w:sz="0"/>
+              <w:bottom w:val="none" w:color="FFFFFF" w:sz="0"/>
+              <w:right w:val="none" w:color="FFFFFF" w:sz="0"/>
+            </w:tcBorders>
+            <w:tcMar>
+              <w:top w:type="dxa" w:w="80"/>
+              <w:left w:type="dxa" w:w="0"/>
+              <w:bottom w:type="dxa" w:w="240"/>
+              <w:right w:type="dxa" w:w="200"/>
+            </w:tcMar>
+          </w:tcPr>
+          <w:p>
+            <w:r>
+              <w:rPr>
+                <w:rFonts w:ascii="Manrope" w:cs="Manrope" w:eastAsia="Manrope" w:hAnsi="Manrope"/>
+                <w:b/>
+                <w:bCs/>
+                <w:color w:val="46C1C0"/>
+                <w:sz w:val="64"/>
+                <w:szCs w:val="64"/>
+              </w:rPr>
+              <w:t xml:space="preserve">5</w:t>
+            </w:r>
+          </w:p>
+        </w:tc>
+        <w:tc>
+          <w:tcPr>
+            <w:tcBorders>
+              <w:top w:val="none" w:color="FFFFFF" w:sz="0"/>
+              <w:left w:val="none" w:color="FFFFFF" w:sz="0"/>
+              <w:bottom w:val="none" w:color="FFFFFF" w:sz="0"/>
+              <w:right w:val="none" w:color="FFFFFF" w:sz="0"/>
+            </w:tcBorders>
+            <w:tcMar>
+              <w:top w:type="dxa" w:w="80"/>
+              <w:left w:type="dxa" w:w="0"/>
+              <w:bottom w:type="dxa" w:w="240"/>
+              <w:right w:type="dxa" w:w="0"/>
+            </w:tcMar>
+          </w:tcPr>
+          <w:p>
+            <w:pPr>
+              <w:spacing w:after="100"/>
+            </w:pPr>
+            <w:r>
+              <w:rPr>
+                <w:rFonts w:ascii="Manrope" w:cs="Manrope" w:eastAsia="Manrope" w:hAnsi="Manrope"/>
+                <w:b/>
+                <w:bCs/>
+                <w:caps/>
+                <w:color w:val="132232"/>
+                <w:spacing w:val="16"/>
+                <w:sz w:val="28"/>
+                <w:szCs w:val="28"/>
+              </w:rPr>
+              <w:t xml:space="preserve">YOUR ASSESSMENT RESULTS</w:t>
+            </w:r>
+          </w:p>
+        </w:tc>
+      </w:tr>
+    </w:tbl>
+    <w:tbl>
+      <w:tblPr>
+        <w:tblW w:type="pct" w:w="100%"/>
+        <w:tblBorders>
+          <w:top w:val="none" w:color="FFFFFF" w:sz="0"/>
+          <w:left w:val="none" w:color="FFFFFF" w:sz="0"/>
+          <w:bottom w:val="none" w:color="FFFFFF" w:sz="0"/>
+          <w:right w:val="none" w:color="FFFFFF" w:sz="0"/>
+          <w:insideH w:val="single" w:color="auto" w:sz="4"/>
+          <w:insideV w:val="single" w:color="auto" w:sz="4"/>
+        </w:tblBorders>
+      </w:tblPr>
+      <w:tblGrid>
+        <w:gridCol w:w="3100"/>
+        <w:gridCol w:w="2100"/>
+        <w:gridCol w:w="4400"/>
+      </w:tblGrid>
+      <w:tr>
+        <w:trPr>
+          <w:tblHeader/>
+        </w:trPr>
+        <w:tc>
+          <w:tcPr>
+            <w:tcW w:type="pct" w:w="32%"/>
+            <w:tcBorders>
+              <w:top w:val="none" w:color="FFFFFF" w:sz="0"/>
+              <w:left w:val="none" w:color="FFFFFF" w:sz="0"/>
+              <w:bottom w:val="none" w:color="FFFFFF" w:sz="0"/>
+              <w:right w:val="none" w:color="FFFFFF" w:sz="0"/>
+            </w:tcBorders>
+            <w:shd w:fill="132232" w:color="auto" w:val="clear"/>
+            <w:tcMar>
+              <w:top w:type="dxa" w:w="120"/>
+              <w:left w:type="dxa" w:w="200"/>
+              <w:bottom w:type="dxa" w:w="120"/>
+              <w:right w:type="dxa" w:w="200"/>
+            </w:tcMar>
+          </w:tcPr>
+          <w:p>
+            <w:r>
+              <w:rPr>
+                <w:rFonts w:ascii="Manrope" w:cs="Manrope" w:eastAsia="Manrope" w:hAnsi="Manrope"/>
+                <w:b/>
+                <w:bCs/>
+                <w:caps/>
+                <w:color w:val="FFFFFF"/>
+                <w:spacing w:val="24"/>
+                <w:sz w:val="17"/>
+                <w:szCs w:val="17"/>
+              </w:rPr>
+              <w:t xml:space="preserve">TEST</w:t>
+            </w:r>
+          </w:p>
+        </w:tc>
+        <w:tc>
+          <w:tcPr>
+            <w:tcW w:type="pct" w:w="22%"/>
+            <w:tcBorders>
+              <w:top w:val="none" w:color="FFFFFF" w:sz="0"/>
+              <w:left w:val="none" w:color="FFFFFF" w:sz="0"/>
+              <w:bottom w:val="none" w:color="FFFFFF" w:sz="0"/>
+              <w:right w:val="none" w:color="FFFFFF" w:sz="0"/>
+            </w:tcBorders>
+            <w:shd w:fill="132232" w:color="auto" w:val="clear"/>
+            <w:tcMar>
+              <w:top w:type="dxa" w:w="120"/>
+              <w:left w:type="dxa" w:w="200"/>
+              <w:bottom w:type="dxa" w:w="120"/>
+              <w:right w:type="dxa" w:w="200"/>
+            </w:tcMar>
+          </w:tcPr>
+          <w:p>
+            <w:r>
+              <w:rPr>
+                <w:rFonts w:ascii="Manrope" w:cs="Manrope" w:eastAsia="Manrope" w:hAnsi="Manrope"/>
+                <w:b/>
+                <w:bCs/>
+                <w:caps/>
+                <w:color w:val="FFFFFF"/>
+                <w:spacing w:val="24"/>
+                <w:sz w:val="17"/>
+                <w:szCs w:val="17"/>
+              </w:rPr>
+              <w:t xml:space="preserve">RESULT</w:t>
+            </w:r>
+          </w:p>
+        </w:tc>
+        <w:tc>
+          <w:tcPr>
+            <w:tcBorders>
+              <w:top w:val="none" w:color="FFFFFF" w:sz="0"/>
+              <w:left w:val="none" w:color="FFFFFF" w:sz="0"/>
+              <w:bottom w:val="none" w:color="FFFFFF" w:sz="0"/>
+              <w:right w:val="none" w:color="FFFFFF" w:sz="0"/>
+            </w:tcBorders>
+            <w:shd w:fill="132232" w:color="auto" w:val="clear"/>
+            <w:tcMar>
+              <w:top w:type="dxa" w:w="120"/>
+              <w:left w:type="dxa" w:w="200"/>
+              <w:bottom w:type="dxa" w:w="120"/>
+              <w:right w:type="dxa" w:w="200"/>
+            </w:tcMar>
+          </w:tcPr>
+          <w:p>
+            <w:r>
+              <w:rPr>
+                <w:rFonts w:ascii="Manrope" w:cs="Manrope" w:eastAsia="Manrope" w:hAnsi="Manrope"/>
+                <w:b/>
+                <w:bCs/>
+                <w:caps/>
+                <w:color w:val="FFFFFF"/>
+                <w:spacing w:val="24"/>
+                <w:sz w:val="17"/>
+                <w:szCs w:val="17"/>
+              </w:rPr>
+              <w:t xml:space="preserve">INTERPRETATION</w:t>
+            </w:r>
+          </w:p>
+        </w:tc>
+      </w:tr>
+      <w:tr>
+        <w:tc>
+          <w:tcPr>
+            <w:tcBorders>
+              <w:top w:val="none" w:color="FFFFFF" w:sz="0"/>
+              <w:left w:val="none" w:color="FFFFFF" w:sz="0"/>
+              <w:bottom w:val="single" w:color="E2E8F0" w:sz="4"/>
+              <w:right w:val="none" w:color="FFFFFF" w:sz="0"/>
+            </w:tcBorders>
+            <w:tcMar>
+              <w:top w:type="dxa" w:w="140"/>
+              <w:left w:type="dxa" w:w="200"/>
+              <w:bottom w:type="dxa" w:w="140"/>
+              <w:right w:type="dxa" w:w="200"/>
+            </w:tcMar>
+          </w:tcPr>
+          <w:p>
+            <w:r>
+              <w:rPr>
+                <w:rFonts w:ascii="Manrope" w:cs="Manrope" w:eastAsia="Manrope" w:hAnsi="Manrope"/>
+                <w:b/>
+                <w:bCs/>
+                <w:color w:val="132232"/>
+                <w:sz w:val="22"/>
+                <w:szCs w:val="22"/>
+              </w:rPr>
+              <w:t xml:space="preserve">{{#assessment_rows}}{{test}}</w:t>
+            </w:r>
+          </w:p>
+        </w:tc>
+        <w:tc>
+          <w:tcPr>
+            <w:tcBorders>
+              <w:top w:val="none" w:color="FFFFFF" w:sz="0"/>
+              <w:left w:val="none" w:color="FFFFFF" w:sz="0"/>
+              <w:bottom w:val="single" w:color="E2E8F0" w:sz="4"/>
+              <w:right w:val="none" w:color="FFFFFF" w:sz="0"/>
+            </w:tcBorders>
+            <w:tcMar>
+              <w:top w:type="dxa" w:w="140"/>
+              <w:left w:type="dxa" w:w="200"/>
+              <w:bottom w:type="dxa" w:w="140"/>
+              <w:right w:type="dxa" w:w="200"/>
+            </w:tcMar>
+          </w:tcPr>
+          <w:p>
+            <w:r>
+              <w:rPr>
+                <w:rFonts w:ascii="Manrope" w:cs="Manrope" w:eastAsia="Manrope" w:hAnsi="Manrope"/>
+                <w:b/>
+                <w:bCs/>
+                <w:color w:val="132232"/>
+                <w:sz w:val="22"/>
+                <w:szCs w:val="22"/>
+              </w:rPr>
+              <w:t xml:space="preserve">{{result}}</w:t>
+            </w:r>
+          </w:p>
+        </w:tc>
+        <w:tc>
+          <w:tcPr>
+            <w:tcBorders>
+              <w:top w:val="none" w:color="FFFFFF" w:sz="0"/>
+              <w:left w:val="none" w:color="FFFFFF" w:sz="0"/>
+              <w:bottom w:val="single" w:color="E2E8F0" w:sz="4"/>
+              <w:right w:val="none" w:color="FFFFFF" w:sz="0"/>
+            </w:tcBorders>
+            <w:tcMar>
+              <w:top w:type="dxa" w:w="140"/>
+              <w:left w:type="dxa" w:w="200"/>
+              <w:bottom w:type="dxa" w:w="140"/>
+              <w:right w:type="dxa" w:w="200"/>
+            </w:tcMar>
+          </w:tcPr>
+          <w:p>
+            <w:r>
+              <w:rPr>
+                <w:rFonts w:ascii="Manrope" w:cs="Manrope" w:eastAsia="Manrope" w:hAnsi="Manrope"/>
+                <w:color w:val="56606E"/>
+                <w:sz w:val="22"/>
+                <w:szCs w:val="22"/>
+              </w:rPr>
+              <w:t xml:space="preserve">{{interpretation}}{{/assessment_rows}}</w:t>
+            </w:r>
+          </w:p>
+        </w:tc>
+      </w:tr>
+    </w:tbl>
+    <w:p>
+      <w:pPr>
+        <w:keepNext/>
+        <w:spacing w:after="160" w:before="240"/>
+      </w:pPr>
+      <w:r>
+        <w:rPr>
+          <w:rFonts w:ascii="Manrope" w:cs="Manrope" w:eastAsia="Manrope" w:hAnsi="Manrope"/>
+          <w:b/>
+          <w:bCs/>
+          <w:color w:val="46C1C0"/>
+          <w:sz w:val="26"/>
+          <w:szCs w:val="26"/>
+        </w:rPr>
+        <w:t xml:space="preserve">▬  </w:t>
+      </w:r>
+      <w:r>
+        <w:rPr>
+          <w:rFonts w:ascii="Manrope" w:cs="Manrope" w:eastAsia="Manrope" w:hAnsi="Manrope"/>
+          <w:b/>
+          <w:bCs/>
+          <w:caps/>
+          <w:color w:val="132232"/>
+          <w:spacing w:val="16"/>
+          <w:sz w:val="26"/>
+          <w:szCs w:val="26"/>
+        </w:rPr>
+        <w:t xml:space="preserve">WHAT YOUR RESULTS MEAN</w:t>
+      </w:r>
+    </w:p>
+    <w:p>
+      <w:pPr>
+        <w:keepLines/>
+      </w:pPr>
+      <w:r>
+        <w:rPr>
+          <w:rFonts w:ascii="Manrope" w:cs="Manrope" w:eastAsia="Manrope" w:hAnsi="Manrope"/>
+          <w:color w:val="1A2230"/>
+          <w:sz w:val="23"/>
+          <w:szCs w:val="23"/>
+        </w:rPr>
+        <w:t xml:space="preserve">Each measurement above is a snapshot, not a verdict. We compare your results against what is typical for your age and goals to find your starting point — the areas where focused work will make the biggest difference. A score outside the usual range is not a cause for alarm; it is simply where we begin, and it is exactly what your program is built to improve. We will repeat these tests at your reassessment so you can see your progress in black and white.</w:t>
+      </w:r>
+    </w:p>
+    <w:p>
+      <w:pPr>
+        <w:pageBreakBefore/>
+      </w:pPr>
+    </w:p>
+    <w:tbl>
+      <w:tblPr>
+        <w:tblW w:type="pct" w:w="100%"/>
+        <w:tblBorders>
+          <w:top w:val="none" w:color="FFFFFF" w:sz="0"/>
+          <w:left w:val="none" w:color="FFFFFF" w:sz="0"/>
+          <w:bottom w:val="single" w:color="E2E8F0" w:sz="4"/>
+          <w:right w:val="none" w:color="FFFFFF" w:sz="0"/>
+          <w:insideH w:val="none" w:color="FFFFFF" w:sz="0"/>
+          <w:insideV w:val="none" w:color="FFFFFF" w:sz="0"/>
+        </w:tblBorders>
+      </w:tblPr>
+      <w:tblGrid>
+        <w:gridCol w:w="100"/>
+        <w:gridCol w:w="100"/>
+      </w:tblGrid>
+      <w:tr>
+        <w:tc>
+          <w:tcPr>
+            <w:tcBorders>
+              <w:top w:val="none" w:color="FFFFFF" w:sz="0"/>
+              <w:left w:val="none" w:color="FFFFFF" w:sz="0"/>
+              <w:bottom w:val="none" w:color="FFFFFF" w:sz="0"/>
+              <w:right w:val="none" w:color="FFFFFF" w:sz="0"/>
+            </w:tcBorders>
+            <w:tcMar>
+              <w:top w:type="dxa" w:w="120"/>
+              <w:left w:type="dxa" w:w="0"/>
+              <w:bottom w:type="dxa" w:w="160"/>
+              <w:right w:type="dxa" w:w="0"/>
+            </w:tcMar>
+            <w:vAlign w:val="center"/>
+          </w:tcPr>
+          <w:p>
+            <w:r>
+              <w:drawing>
+                <wp:inline distT="0" distB="0" distL="0" distR="0">
+                  <wp:extent cx="847725" cy="476250"/>
+                  <wp:effectExtent t="0" r="0" b="0" l="0"/>
+                  <wp:docPr id="1" name="" descr="" title=""/>
+                  <wp:cNvGraphicFramePr>
+                    <a:graphicFrameLocks xmlns:a="http://schemas.openxmlformats.org/drawingml/2006/main" noChangeAspect="1"/>
+                  </wp:cNvGraphicFramePr>
+                  <a:graphic xmlns:a="http://schemas.openxmlformats.org/drawingml/2006/main">
+                    <a:graphicData uri="http://schemas.openxmlformats.org/drawingml/2006/picture">
+                      <pic:pic xmlns:pic="http://schemas.openxmlformats.org/drawingml/2006/picture">
+                        <pic:nvPicPr>
+                          <pic:cNvPr id="0" name="" descr=""/>
+                          <pic:cNvPicPr>
+                            <a:picLocks noChangeAspect="1" noChangeArrowheads="1"/>
+                          </pic:cNvPicPr>
+                        </pic:nvPicPr>
+                        <pic:blipFill>
+                          <a:blip r:embed="rId7" cstate="none"/>
+                          <a:srcRect/>
+                          <a:stretch>
+                            <a:fillRect/>
+                          </a:stretch>
+                        </pic:blipFill>
+                        <pic:spPr bwMode="auto">
+                          <a:xfrm>
+                            <a:off x="0" y="0"/>
+                            <a:ext cx="847725" cy="476250"/>
+                          </a:xfrm>
+                          <a:prstGeom prst="rect">
+                            <a:avLst/>
+                          </a:prstGeom>
+                        </pic:spPr>
+                      </pic:pic>
+                    </a:graphicData>
+                  </a:graphic>
+                </wp:inline>
+              </w:drawing>
+            </w:r>
+          </w:p>
+        </w:tc>
+        <w:tc>
+          <w:tcPr>
+            <w:tcBorders>
+              <w:top w:val="none" w:color="FFFFFF" w:sz="0"/>
+              <w:left w:val="none" w:color="FFFFFF" w:sz="0"/>
+              <w:bottom w:val="none" w:color="FFFFFF" w:sz="0"/>
+              <w:right w:val="none" w:color="FFFFFF" w:sz="0"/>
+            </w:tcBorders>
+            <w:tcMar>
+              <w:top w:type="dxa" w:w="120"/>
+              <w:left w:type="dxa" w:w="0"/>
+              <w:bottom w:type="dxa" w:w="160"/>
+              <w:right w:type="dxa" w:w="0"/>
+            </w:tcMar>
+            <w:vAlign w:val="center"/>
+          </w:tcPr>
+          <w:p>
+            <w:pPr>
+              <w:jc w:val="right"/>
+            </w:pPr>
+            <w:r>
+              <w:rPr>
+                <w:rFonts w:ascii="Manrope" w:cs="Manrope" w:eastAsia="Manrope" w:hAnsi="Manrope"/>
+                <w:b/>
+                <w:bCs/>
+                <w:color w:val="132232"/>
+                <w:sz w:val="17"/>
+                <w:szCs w:val="17"/>
+              </w:rPr>
+              <w:t xml:space="preserve">Moveify Health Solutions</w:t>
+            </w:r>
+          </w:p>
+          <w:p>
+            <w:pPr>
+              <w:spacing w:before="20"/>
+              <w:jc w:val="right"/>
+            </w:pPr>
+            <w:r>
+              <w:rPr>
+                <w:rFonts w:ascii="Manrope" w:cs="Manrope" w:eastAsia="Manrope" w:hAnsi="Manrope"/>
+                <w:color w:val="56606E"/>
+                <w:sz w:val="17"/>
+                <w:szCs w:val="17"/>
+              </w:rPr>
+              <w:t xml:space="preserve">4 George St, Williamstown SA 5351</w:t>
+            </w:r>
+            <w:r>
+              <w:rPr>
+                <w:rFonts w:ascii="Manrope" w:cs="Manrope" w:eastAsia="Manrope" w:hAnsi="Manrope"/>
+                <w:b/>
+                <w:bCs/>
+                <w:color w:val="46C1C0"/>
+                <w:sz w:val="17"/>
+                <w:szCs w:val="17"/>
+              </w:rPr>
+              <w:t xml:space="preserve">  ·  </w:t>
+            </w:r>
+            <w:r>
+              <w:rPr>
+                <w:rFonts w:ascii="Manrope" w:cs="Manrope" w:eastAsia="Manrope" w:hAnsi="Manrope"/>
+                <w:color w:val="56606E"/>
+                <w:sz w:val="17"/>
+                <w:szCs w:val="17"/>
+              </w:rPr>
+              <w:t xml:space="preserve">0435 524 991</w:t>
+            </w:r>
+            <w:r>
+              <w:rPr>
+                <w:rFonts w:ascii="Manrope" w:cs="Manrope" w:eastAsia="Manrope" w:hAnsi="Manrope"/>
+                <w:b/>
+                <w:bCs/>
+                <w:color w:val="46C1C0"/>
+                <w:sz w:val="17"/>
+                <w:szCs w:val="17"/>
+              </w:rPr>
+              <w:t xml:space="preserve">  ·  </w:t>
+            </w:r>
+            <w:r>
+              <w:rPr>
+                <w:rFonts w:ascii="Manrope" w:cs="Manrope" w:eastAsia="Manrope" w:hAnsi="Manrope"/>
+                <w:color w:val="56606E"/>
+                <w:sz w:val="17"/>
+                <w:szCs w:val="17"/>
+              </w:rPr>
+              <w:t xml:space="preserve">ryan@moveifyhealth.com</w:t>
+            </w:r>
+          </w:p>
+        </w:tc>
+      </w:tr>
+    </w:tbl>
+    <w:tbl>
+      <w:tblPr>
+        <w:tblW w:type="pct" w:w="100%"/>
+        <w:tblBorders>
+          <w:top w:val="none" w:color="FFFFFF" w:sz="0"/>
+          <w:left w:val="none" w:color="FFFFFF" w:sz="0"/>
+          <w:bottom w:val="none" w:color="FFFFFF" w:sz="0"/>
+          <w:right w:val="none" w:color="FFFFFF" w:sz="0"/>
+          <w:insideH w:val="single" w:color="auto" w:sz="4"/>
+          <w:insideV w:val="single" w:color="auto" w:sz="4"/>
+        </w:tblBorders>
+      </w:tblPr>
+      <w:tblGrid>
+        <w:gridCol w:w="8600"/>
+        <w:gridCol w:w="1000"/>
+      </w:tblGrid>
+      <w:tr>
+        <w:tc>
+          <w:tcPr>
+            <w:tcBorders>
+              <w:top w:val="none" w:color="FFFFFF" w:sz="0"/>
+              <w:left w:val="none" w:color="FFFFFF" w:sz="0"/>
+              <w:bottom w:val="none" w:color="FFFFFF" w:sz="0"/>
+              <w:right w:val="none" w:color="FFFFFF" w:sz="0"/>
+            </w:tcBorders>
+            <w:shd w:fill="132232" w:color="auto" w:val="clear"/>
+            <w:tcMar>
+              <w:top w:type="dxa" w:w="360"/>
+              <w:left w:type="dxa" w:w="360"/>
+              <w:bottom w:type="dxa" w:w="340"/>
+              <w:right w:type="dxa" w:w="200"/>
+            </w:tcMar>
+          </w:tcPr>
+          <w:p>
+            <w:pPr>
+              <w:spacing w:after="120"/>
+            </w:pPr>
+            <w:r>
+              <w:rPr>
+                <w:rFonts w:ascii="Manrope" w:cs="Manrope" w:eastAsia="Manrope" w:hAnsi="Manrope"/>
+                <w:b/>
+                <w:bCs/>
+                <w:caps/>
+                <w:color w:val="46C1C0"/>
+                <w:spacing w:val="40"/>
+                <w:sz w:val="17"/>
+                <w:szCs w:val="17"/>
+              </w:rPr>
+              <w:t xml:space="preserve">TREATMENT OPTIONS</w:t>
             </w:r>
           </w:p>
           <w:p>
@@ -1332,8 +1678,8 @@
           <w:b/>
           <w:bCs/>
           <w:color w:val="132232"/>
-          <w:sz w:val="21"/>
-          <w:szCs w:val="21"/>
+          <w:sz w:val="23"/>
+          <w:szCs w:val="23"/>
         </w:rPr>
         <w:t xml:space="preserve">How it works. </w:t>
       </w:r>
@@ -1341,8 +1687,8 @@
         <w:rPr>
           <w:rFonts w:ascii="Manrope" w:cs="Manrope" w:eastAsia="Manrope" w:hAnsi="Manrope"/>
           <w:color w:val="1A2230"/>
-          <w:sz w:val="21"/>
-          <w:szCs w:val="21"/>
+          <w:sz w:val="23"/>
+          <w:szCs w:val="23"/>
         </w:rPr>
         <w:t xml:space="preserve">Payment is weekly direct debit over 6 weeks, or pay in full with a 5% discount. Every tier includes unlimited gym access and the Moveify app. The clinical program is the same across all three — the tiers differ in how much 1:1 support and supervision you receive.</w:t>
       </w:r>
@@ -1760,6 +2106,177 @@
                 <w:szCs w:val="16"/>
               </w:rPr>
               <w:t xml:space="preserve">↓ Medicare &amp; private health rebates available</w:t>
+            </w:r>
+          </w:p>
+        </w:tc>
+      </w:tr>
+    </w:tbl>
+    <w:p>
+      <w:pPr>
+        <w:pageBreakBefore/>
+      </w:pPr>
+    </w:p>
+    <w:tbl>
+      <w:tblPr>
+        <w:tblW w:type="pct" w:w="100%"/>
+        <w:tblBorders>
+          <w:top w:val="none" w:color="FFFFFF" w:sz="0"/>
+          <w:left w:val="none" w:color="FFFFFF" w:sz="0"/>
+          <w:bottom w:val="single" w:color="E2E8F0" w:sz="4"/>
+          <w:right w:val="none" w:color="FFFFFF" w:sz="0"/>
+          <w:insideH w:val="none" w:color="FFFFFF" w:sz="0"/>
+          <w:insideV w:val="none" w:color="FFFFFF" w:sz="0"/>
+        </w:tblBorders>
+      </w:tblPr>
+      <w:tblGrid>
+        <w:gridCol w:w="100"/>
+        <w:gridCol w:w="100"/>
+      </w:tblGrid>
+      <w:tr>
+        <w:tc>
+          <w:tcPr>
+            <w:tcBorders>
+              <w:top w:val="none" w:color="FFFFFF" w:sz="0"/>
+              <w:left w:val="none" w:color="FFFFFF" w:sz="0"/>
+              <w:bottom w:val="none" w:color="FFFFFF" w:sz="0"/>
+              <w:right w:val="none" w:color="FFFFFF" w:sz="0"/>
+            </w:tcBorders>
+            <w:tcMar>
+              <w:top w:type="dxa" w:w="120"/>
+              <w:left w:type="dxa" w:w="0"/>
+              <w:bottom w:type="dxa" w:w="160"/>
+              <w:right w:type="dxa" w:w="0"/>
+            </w:tcMar>
+            <w:vAlign w:val="center"/>
+          </w:tcPr>
+          <w:p>
+            <w:r>
+              <w:drawing>
+                <wp:inline distT="0" distB="0" distL="0" distR="0">
+                  <wp:extent cx="847725" cy="476250"/>
+                  <wp:effectExtent t="0" r="0" b="0" l="0"/>
+                  <wp:docPr id="1" name="" descr="" title=""/>
+                  <wp:cNvGraphicFramePr>
+                    <a:graphicFrameLocks xmlns:a="http://schemas.openxmlformats.org/drawingml/2006/main" noChangeAspect="1"/>
+                  </wp:cNvGraphicFramePr>
+                  <a:graphic xmlns:a="http://schemas.openxmlformats.org/drawingml/2006/main">
+                    <a:graphicData uri="http://schemas.openxmlformats.org/drawingml/2006/picture">
+                      <pic:pic xmlns:pic="http://schemas.openxmlformats.org/drawingml/2006/picture">
+                        <pic:nvPicPr>
+                          <pic:cNvPr id="0" name="" descr=""/>
+                          <pic:cNvPicPr>
+                            <a:picLocks noChangeAspect="1" noChangeArrowheads="1"/>
+                          </pic:cNvPicPr>
+                        </pic:nvPicPr>
+                        <pic:blipFill>
+                          <a:blip r:embed="rId7" cstate="none"/>
+                          <a:srcRect/>
+                          <a:stretch>
+                            <a:fillRect/>
+                          </a:stretch>
+                        </pic:blipFill>
+                        <pic:spPr bwMode="auto">
+                          <a:xfrm>
+                            <a:off x="0" y="0"/>
+                            <a:ext cx="847725" cy="476250"/>
+                          </a:xfrm>
+                          <a:prstGeom prst="rect">
+                            <a:avLst/>
+                          </a:prstGeom>
+                        </pic:spPr>
+                      </pic:pic>
+                    </a:graphicData>
+                  </a:graphic>
+                </wp:inline>
+              </w:drawing>
+            </w:r>
+          </w:p>
+        </w:tc>
+        <w:tc>
+          <w:tcPr>
+            <w:tcBorders>
+              <w:top w:val="none" w:color="FFFFFF" w:sz="0"/>
+              <w:left w:val="none" w:color="FFFFFF" w:sz="0"/>
+              <w:bottom w:val="none" w:color="FFFFFF" w:sz="0"/>
+              <w:right w:val="none" w:color="FFFFFF" w:sz="0"/>
+            </w:tcBorders>
+            <w:tcMar>
+              <w:top w:type="dxa" w:w="120"/>
+              <w:left w:type="dxa" w:w="0"/>
+              <w:bottom w:type="dxa" w:w="160"/>
+              <w:right w:type="dxa" w:w="0"/>
+            </w:tcMar>
+            <w:vAlign w:val="center"/>
+          </w:tcPr>
+          <w:p>
+            <w:pPr>
+              <w:jc w:val="right"/>
+            </w:pPr>
+            <w:r>
+              <w:rPr>
+                <w:rFonts w:ascii="Manrope" w:cs="Manrope" w:eastAsia="Manrope" w:hAnsi="Manrope"/>
+                <w:b/>
+                <w:bCs/>
+                <w:color w:val="132232"/>
+                <w:sz w:val="17"/>
+                <w:szCs w:val="17"/>
+              </w:rPr>
+              <w:t xml:space="preserve">Moveify Health Solutions</w:t>
+            </w:r>
+          </w:p>
+          <w:p>
+            <w:pPr>
+              <w:spacing w:before="20"/>
+              <w:jc w:val="right"/>
+            </w:pPr>
+            <w:r>
+              <w:rPr>
+                <w:rFonts w:ascii="Manrope" w:cs="Manrope" w:eastAsia="Manrope" w:hAnsi="Manrope"/>
+                <w:color w:val="56606E"/>
+                <w:sz w:val="17"/>
+                <w:szCs w:val="17"/>
+              </w:rPr>
+              <w:t xml:space="preserve">4 George St, Williamstown SA 5351</w:t>
+            </w:r>
+            <w:r>
+              <w:rPr>
+                <w:rFonts w:ascii="Manrope" w:cs="Manrope" w:eastAsia="Manrope" w:hAnsi="Manrope"/>
+                <w:b/>
+                <w:bCs/>
+                <w:color w:val="46C1C0"/>
+                <w:sz w:val="17"/>
+                <w:szCs w:val="17"/>
+              </w:rPr>
+              <w:t xml:space="preserve">  ·  </w:t>
+            </w:r>
+            <w:r>
+              <w:rPr>
+                <w:rFonts w:ascii="Manrope" w:cs="Manrope" w:eastAsia="Manrope" w:hAnsi="Manrope"/>
+                <w:color w:val="56606E"/>
+                <w:sz w:val="17"/>
+                <w:szCs w:val="17"/>
+              </w:rPr>
+              <w:t xml:space="preserve">0435 524 991</w:t>
+            </w:r>
+            <w:r>
+              <w:rPr>
+                <w:rFonts w:ascii="Manrope" w:cs="Manrope" w:eastAsia="Manrope" w:hAnsi="Manrope"/>
+                <w:b/>
+                <w:bCs/>
+                <w:color w:val="46C1C0"/>
+                <w:sz w:val="17"/>
+                <w:szCs w:val="17"/>
+              </w:rPr>
+              <w:t xml:space="preserve">  ·  </w:t>
+            </w:r>
+            <w:r>
+              <w:rPr>
+                <w:rFonts w:ascii="Manrope" w:cs="Manrope" w:eastAsia="Manrope" w:hAnsi="Manrope"/>
+                <w:color w:val="56606E"/>
+                <w:sz w:val="17"/>
+                <w:szCs w:val="17"/>
+              </w:rPr>
+              <w:t xml:space="preserve">ryan@moveifyhealth.com</w:t>
             </w:r>
           </w:p>
         </w:tc>
@@ -1939,8 +2456,8 @@
               <w:rPr>
                 <w:rFonts w:ascii="Manrope" w:cs="Manrope" w:eastAsia="Manrope" w:hAnsi="Manrope"/>
                 <w:color w:val="1A2230"/>
-                <w:sz w:val="20"/>
-                <w:szCs w:val="20"/>
+                <w:sz w:val="22"/>
+                <w:szCs w:val="22"/>
               </w:rPr>
               <w:t xml:space="preserve">1:1 Consultation (60 min)</w:t>
             </w:r>
@@ -1968,8 +2485,8 @@
                 <w:b/>
                 <w:bCs/>
                 <w:color w:val="132232"/>
-                <w:sz w:val="20"/>
-                <w:szCs w:val="20"/>
+                <w:sz w:val="22"/>
+                <w:szCs w:val="22"/>
               </w:rPr>
               <w:t xml:space="preserve">$170</w:t>
             </w:r>
@@ -1995,8 +2512,8 @@
               <w:rPr>
                 <w:rFonts w:ascii="Manrope" w:cs="Manrope" w:eastAsia="Manrope" w:hAnsi="Manrope"/>
                 <w:color w:val="56606E"/>
-                <w:sz w:val="20"/>
-                <w:szCs w:val="20"/>
+                <w:sz w:val="22"/>
+                <w:szCs w:val="22"/>
               </w:rPr>
               <w:t xml:space="preserve">Full program design or complex consultation</w:t>
             </w:r>
@@ -2027,8 +2544,8 @@
               <w:rPr>
                 <w:rFonts w:ascii="Manrope" w:cs="Manrope" w:eastAsia="Manrope" w:hAnsi="Manrope"/>
                 <w:color w:val="1A2230"/>
-                <w:sz w:val="20"/>
-                <w:szCs w:val="20"/>
+                <w:sz w:val="22"/>
+                <w:szCs w:val="22"/>
               </w:rPr>
               <w:t xml:space="preserve">1:1 Consultation (45 min)</w:t>
             </w:r>
@@ -2056,8 +2573,8 @@
                 <w:b/>
                 <w:bCs/>
                 <w:color w:val="132232"/>
-                <w:sz w:val="20"/>
-                <w:szCs w:val="20"/>
+                <w:sz w:val="22"/>
+                <w:szCs w:val="22"/>
               </w:rPr>
               <w:t xml:space="preserve">$130</w:t>
             </w:r>
@@ -2083,8 +2600,8 @@
               <w:rPr>
                 <w:rFonts w:ascii="Manrope" w:cs="Manrope" w:eastAsia="Manrope" w:hAnsi="Manrope"/>
                 <w:color w:val="56606E"/>
-                <w:sz w:val="20"/>
-                <w:szCs w:val="20"/>
+                <w:sz w:val="22"/>
+                <w:szCs w:val="22"/>
               </w:rPr>
               <w:t xml:space="preserve">Standard clinical session</w:t>
             </w:r>
@@ -2115,8 +2632,8 @@
               <w:rPr>
                 <w:rFonts w:ascii="Manrope" w:cs="Manrope" w:eastAsia="Manrope" w:hAnsi="Manrope"/>
                 <w:color w:val="1A2230"/>
-                <w:sz w:val="20"/>
-                <w:szCs w:val="20"/>
+                <w:sz w:val="22"/>
+                <w:szCs w:val="22"/>
               </w:rPr>
               <w:t xml:space="preserve">1:1 Consultation (30 min)</w:t>
             </w:r>
@@ -2144,8 +2661,8 @@
                 <w:b/>
                 <w:bCs/>
                 <w:color w:val="132232"/>
-                <w:sz w:val="20"/>
-                <w:szCs w:val="20"/>
+                <w:sz w:val="22"/>
+                <w:szCs w:val="22"/>
               </w:rPr>
               <w:t xml:space="preserve">$85</w:t>
             </w:r>
@@ -2171,8 +2688,8 @@
               <w:rPr>
                 <w:rFonts w:ascii="Manrope" w:cs="Manrope" w:eastAsia="Manrope" w:hAnsi="Manrope"/>
                 <w:color w:val="56606E"/>
-                <w:sz w:val="20"/>
-                <w:szCs w:val="20"/>
+                <w:sz w:val="22"/>
+                <w:szCs w:val="22"/>
               </w:rPr>
               <w:t xml:space="preserve">Follow-up or program adjustment</w:t>
             </w:r>
@@ -2203,8 +2720,8 @@
               <w:rPr>
                 <w:rFonts w:ascii="Manrope" w:cs="Manrope" w:eastAsia="Manrope" w:hAnsi="Manrope"/>
                 <w:color w:val="1A2230"/>
-                <w:sz w:val="20"/>
-                <w:szCs w:val="20"/>
+                <w:sz w:val="22"/>
+                <w:szCs w:val="22"/>
               </w:rPr>
               <w:t xml:space="preserve">Group Session (45–60 min)</w:t>
             </w:r>
@@ -2232,8 +2749,8 @@
                 <w:b/>
                 <w:bCs/>
                 <w:color w:val="132232"/>
-                <w:sz w:val="20"/>
-                <w:szCs w:val="20"/>
+                <w:sz w:val="22"/>
+                <w:szCs w:val="22"/>
               </w:rPr>
               <w:t xml:space="preserve">$30</w:t>
             </w:r>
@@ -2259,8 +2776,8 @@
               <w:rPr>
                 <w:rFonts w:ascii="Manrope" w:cs="Manrope" w:eastAsia="Manrope" w:hAnsi="Manrope"/>
                 <w:color w:val="56606E"/>
-                <w:sz w:val="20"/>
-                <w:szCs w:val="20"/>
+                <w:sz w:val="22"/>
+                <w:szCs w:val="22"/>
               </w:rPr>
               <w:t xml:space="preserve">Supervised floor session with your program</w:t>
             </w:r>
@@ -2291,8 +2808,8 @@
               <w:rPr>
                 <w:rFonts w:ascii="Manrope" w:cs="Manrope" w:eastAsia="Manrope" w:hAnsi="Manrope"/>
                 <w:color w:val="1A2230"/>
-                <w:sz w:val="20"/>
-                <w:szCs w:val="20"/>
+                <w:sz w:val="22"/>
+                <w:szCs w:val="22"/>
               </w:rPr>
               <w:t xml:space="preserve">Phone Check-in (10 min)</w:t>
             </w:r>
@@ -2320,8 +2837,8 @@
                 <w:b/>
                 <w:bCs/>
                 <w:color w:val="132232"/>
-                <w:sz w:val="20"/>
-                <w:szCs w:val="20"/>
+                <w:sz w:val="22"/>
+                <w:szCs w:val="22"/>
               </w:rPr>
               <w:t xml:space="preserve">$50</w:t>
             </w:r>
@@ -2347,8 +2864,8 @@
               <w:rPr>
                 <w:rFonts w:ascii="Manrope" w:cs="Manrope" w:eastAsia="Manrope" w:hAnsi="Manrope"/>
                 <w:color w:val="56606E"/>
-                <w:sz w:val="20"/>
-                <w:szCs w:val="20"/>
+                <w:sz w:val="22"/>
+                <w:szCs w:val="22"/>
               </w:rPr>
               <w:t xml:space="preserve">Brief clinical check-in</w:t>
             </w:r>
@@ -2473,8 +2990,8 @@
               <w:rPr>
                 <w:rFonts w:ascii="Manrope" w:cs="Manrope" w:eastAsia="Manrope" w:hAnsi="Manrope"/>
                 <w:color w:val="1A2230"/>
-                <w:sz w:val="20"/>
-                <w:szCs w:val="20"/>
+                <w:sz w:val="22"/>
+                <w:szCs w:val="22"/>
               </w:rPr>
               <w:t xml:space="preserve">If you have a Chronic Disease Management plan from your GP, you are eligible for up to 5 Medicare-rebated allied health sessions per calendar year. Each eligible 1:1 session earns a rebate of </w:t>
             </w:r>
@@ -2484,8 +3001,8 @@
                 <w:b/>
                 <w:bCs/>
                 <w:color w:val="132232"/>
-                <w:sz w:val="20"/>
-                <w:szCs w:val="20"/>
+                <w:sz w:val="22"/>
+                <w:szCs w:val="22"/>
               </w:rPr>
               <w:t xml:space="preserve">$61.80</w:t>
             </w:r>
@@ -2493,8 +3010,8 @@
               <w:rPr>
                 <w:rFonts w:ascii="Manrope" w:cs="Manrope" w:eastAsia="Manrope" w:hAnsi="Manrope"/>
                 <w:color w:val="1A2230"/>
-                <w:sz w:val="20"/>
-                <w:szCs w:val="20"/>
+                <w:sz w:val="22"/>
+                <w:szCs w:val="22"/>
               </w:rPr>
               <w:t xml:space="preserve">.</w:t>
             </w:r>
@@ -2544,8 +3061,8 @@
               <w:rPr>
                 <w:rFonts w:ascii="Manrope" w:cs="Manrope" w:eastAsia="Manrope" w:hAnsi="Manrope"/>
                 <w:color w:val="1A2230"/>
-                <w:sz w:val="20"/>
-                <w:szCs w:val="20"/>
+                <w:sz w:val="22"/>
+                <w:szCs w:val="22"/>
               </w:rPr>
               <w:t xml:space="preserve">If you hold extras cover, you may be able to claim a rebate on Exercise Physiology sessions. You cannot claim both Medicare and PHI on the same session.</w:t>
             </w:r>

</xml_diff>

<commit_message>
scribe: vertical tier cards + deeper results interpretation
- drop the "5" numeral; assessment page leads with a plain heading
- expand "What Your Results Mean" into a 3-part interpretation guide
  and reference a companion normative-data document
- restack tiers vertically high to low (Performance/Progress/Foundation)
  as full-width cards to fill the white space under "Choose Your Tier"

Co-Authored-By: Claude Opus 4.7 <noreply@anthropic.com>
</commit_message>
<xml_diff>
--- a/backend/assets/Handout_Template.docx
+++ b/backend/assets/Handout_Template.docx
@@ -1017,91 +1017,36 @@
         <w:spacing w:after="240"/>
       </w:pPr>
     </w:p>
-    <w:tbl>
-      <w:tblPr>
-        <w:tblW w:type="pct" w:w="100%"/>
-        <w:tblBorders>
-          <w:top w:val="none" w:color="FFFFFF" w:sz="0"/>
-          <w:left w:val="none" w:color="FFFFFF" w:sz="0"/>
-          <w:bottom w:val="none" w:color="FFFFFF" w:sz="0"/>
-          <w:right w:val="none" w:color="FFFFFF" w:sz="0"/>
-          <w:insideH w:val="single" w:color="auto" w:sz="4"/>
-          <w:insideV w:val="single" w:color="auto" w:sz="4"/>
-        </w:tblBorders>
-      </w:tblPr>
-      <w:tblGrid>
-        <w:gridCol w:w="1100"/>
-        <w:gridCol w:w="8500"/>
-      </w:tblGrid>
-      <w:tr>
-        <w:trPr>
-          <w:cantSplit/>
-        </w:trPr>
-        <w:tc>
-          <w:tcPr>
-            <w:tcBorders>
-              <w:top w:val="none" w:color="FFFFFF" w:sz="0"/>
-              <w:left w:val="none" w:color="FFFFFF" w:sz="0"/>
-              <w:bottom w:val="none" w:color="FFFFFF" w:sz="0"/>
-              <w:right w:val="none" w:color="FFFFFF" w:sz="0"/>
-            </w:tcBorders>
-            <w:tcMar>
-              <w:top w:type="dxa" w:w="80"/>
-              <w:left w:type="dxa" w:w="0"/>
-              <w:bottom w:type="dxa" w:w="240"/>
-              <w:right w:type="dxa" w:w="200"/>
-            </w:tcMar>
-          </w:tcPr>
-          <w:p>
-            <w:r>
-              <w:rPr>
-                <w:rFonts w:ascii="Manrope" w:cs="Manrope" w:eastAsia="Manrope" w:hAnsi="Manrope"/>
-                <w:b/>
-                <w:bCs/>
-                <w:color w:val="46C1C0"/>
-                <w:sz w:val="64"/>
-                <w:szCs w:val="64"/>
-              </w:rPr>
-              <w:t xml:space="preserve">5</w:t>
-            </w:r>
-          </w:p>
-        </w:tc>
-        <w:tc>
-          <w:tcPr>
-            <w:tcBorders>
-              <w:top w:val="none" w:color="FFFFFF" w:sz="0"/>
-              <w:left w:val="none" w:color="FFFFFF" w:sz="0"/>
-              <w:bottom w:val="none" w:color="FFFFFF" w:sz="0"/>
-              <w:right w:val="none" w:color="FFFFFF" w:sz="0"/>
-            </w:tcBorders>
-            <w:tcMar>
-              <w:top w:type="dxa" w:w="80"/>
-              <w:left w:type="dxa" w:w="0"/>
-              <w:bottom w:type="dxa" w:w="240"/>
-              <w:right w:type="dxa" w:w="0"/>
-            </w:tcMar>
-          </w:tcPr>
-          <w:p>
-            <w:pPr>
-              <w:spacing w:after="100"/>
-            </w:pPr>
-            <w:r>
-              <w:rPr>
-                <w:rFonts w:ascii="Manrope" w:cs="Manrope" w:eastAsia="Manrope" w:hAnsi="Manrope"/>
-                <w:b/>
-                <w:bCs/>
-                <w:caps/>
-                <w:color w:val="132232"/>
-                <w:spacing w:val="16"/>
-                <w:sz w:val="28"/>
-                <w:szCs w:val="28"/>
-              </w:rPr>
-              <w:t xml:space="preserve">YOUR ASSESSMENT RESULTS</w:t>
-            </w:r>
-          </w:p>
-        </w:tc>
-      </w:tr>
-    </w:tbl>
+    <w:p>
+      <w:pPr>
+        <w:keepNext/>
+        <w:spacing w:after="160" w:before="240"/>
+      </w:pPr>
+      <w:r>
+        <w:rPr>
+          <w:rFonts w:ascii="Manrope" w:cs="Manrope" w:eastAsia="Manrope" w:hAnsi="Manrope"/>
+          <w:b/>
+          <w:bCs/>
+          <w:color w:val="46C1C0"/>
+          <w:sz w:val="26"/>
+          <w:szCs w:val="26"/>
+        </w:rPr>
+        <w:t xml:space="preserve">▬  </w:t>
+      </w:r>
+      <w:r>
+        <w:rPr>
+          <w:rFonts w:ascii="Manrope" w:cs="Manrope" w:eastAsia="Manrope" w:hAnsi="Manrope"/>
+          <w:b/>
+          <w:bCs/>
+          <w:caps/>
+          <w:color w:val="132232"/>
+          <w:spacing w:val="16"/>
+          <w:sz w:val="26"/>
+          <w:szCs w:val="26"/>
+        </w:rPr>
+        <w:t xml:space="preserve">YOUR RESULTS AT A GLANCE</w:t>
+      </w:r>
+    </w:p>
     <w:tbl>
       <w:tblPr>
         <w:tblW w:type="pct" w:w="100%"/>
@@ -1343,7 +1288,19 @@
     <w:p>
       <w:pPr>
         <w:keepLines/>
+        <w:spacing w:after="200"/>
       </w:pPr>
+      <w:r>
+        <w:rPr>
+          <w:rFonts w:ascii="Manrope" w:cs="Manrope" w:eastAsia="Manrope" w:hAnsi="Manrope"/>
+          <w:b/>
+          <w:bCs/>
+          <w:color w:val="132232"/>
+          <w:sz w:val="23"/>
+          <w:szCs w:val="23"/>
+        </w:rPr>
+        <w:t xml:space="preserve">Reading the table. </w:t>
+      </w:r>
       <w:r>
         <w:rPr>
           <w:rFonts w:ascii="Manrope" w:cs="Manrope" w:eastAsia="Manrope" w:hAnsi="Manrope"/>
@@ -1351,7 +1308,110 @@
           <w:sz w:val="23"/>
           <w:szCs w:val="23"/>
         </w:rPr>
-        <w:t xml:space="preserve">Each measurement above is a snapshot, not a verdict. We compare your results against what is typical for your age and goals to find your starting point — the areas where focused work will make the biggest difference. A score outside the usual range is not a cause for alarm; it is simply where we begin, and it is exactly what your program is built to improve. We will repeat these tests at your reassessment so you can see your progress in black and white.</w:t>
+        <w:t xml:space="preserve">Each test is compared against </w:t>
+      </w:r>
+      <w:r>
+        <w:rPr>
+          <w:rFonts w:ascii="Manrope" w:cs="Manrope" w:eastAsia="Manrope" w:hAnsi="Manrope"/>
+          <w:b/>
+          <w:bCs/>
+          <w:color w:val="132232"/>
+          <w:sz w:val="23"/>
+          <w:szCs w:val="23"/>
+        </w:rPr>
+        <w:t xml:space="preserve">normative data</w:t>
+      </w:r>
+      <w:r>
+        <w:rPr>
+          <w:rFonts w:ascii="Manrope" w:cs="Manrope" w:eastAsia="Manrope" w:hAnsi="Manrope"/>
+          <w:color w:val="1A2230"/>
+          <w:sz w:val="23"/>
+          <w:szCs w:val="23"/>
+        </w:rPr>
+        <w:t xml:space="preserve"> — large reference datasets that describe the typical range for someone of your age, sex, and activity level. Your result is read relative to that range, so it tells us not just a raw number but where you sit among people like you. Where a value falls within the expected range, it is a strength we will protect and build on; where it falls below, it is an opportunity area your program is built to target.</w:t>
+      </w:r>
+    </w:p>
+    <w:p>
+      <w:pPr>
+        <w:keepLines/>
+        <w:spacing w:after="200"/>
+      </w:pPr>
+      <w:r>
+        <w:rPr>
+          <w:rFonts w:ascii="Manrope" w:cs="Manrope" w:eastAsia="Manrope" w:hAnsi="Manrope"/>
+          <w:b/>
+          <w:bCs/>
+          <w:color w:val="132232"/>
+          <w:sz w:val="23"/>
+          <w:szCs w:val="23"/>
+        </w:rPr>
+        <w:t xml:space="preserve">We read patterns, not single numbers. </w:t>
+      </w:r>
+      <w:r>
+        <w:rPr>
+          <w:rFonts w:ascii="Manrope" w:cs="Manrope" w:eastAsia="Manrope" w:hAnsi="Manrope"/>
+          <w:color w:val="1A2230"/>
+          <w:sz w:val="23"/>
+          <w:szCs w:val="23"/>
+        </w:rPr>
+        <w:t xml:space="preserve">One result rarely tells the whole story. We look across the tests together — for example, how your strength, mobility, and balance relate to one another — because it is the pattern that explains your symptoms and points to the most effective starting point. A score outside the usual range is never a cause for alarm; it is simply where we begin.</w:t>
+      </w:r>
+    </w:p>
+    <w:p>
+      <w:pPr>
+        <w:keepLines/>
+        <w:spacing w:after="200"/>
+      </w:pPr>
+      <w:r>
+        <w:rPr>
+          <w:rFonts w:ascii="Manrope" w:cs="Manrope" w:eastAsia="Manrope" w:hAnsi="Manrope"/>
+          <w:b/>
+          <w:bCs/>
+          <w:color w:val="132232"/>
+          <w:sz w:val="23"/>
+          <w:szCs w:val="23"/>
+        </w:rPr>
+        <w:t xml:space="preserve">How this shapes your program. </w:t>
+      </w:r>
+      <w:r>
+        <w:rPr>
+          <w:rFonts w:ascii="Manrope" w:cs="Manrope" w:eastAsia="Manrope" w:hAnsi="Manrope"/>
+          <w:color w:val="1A2230"/>
+          <w:sz w:val="23"/>
+          <w:szCs w:val="23"/>
+        </w:rPr>
+        <w:t xml:space="preserve">These results set your baseline and directly calibrate your plan — the exercises we select, the loads we start at, and how quickly we progress are all chosen from where you are today. We repeat the same tests at your reassessment so the change is measured objectively, in black and white, rather than by feel alone.</w:t>
+      </w:r>
+    </w:p>
+    <w:p>
+      <w:pPr>
+        <w:keepLines/>
+        <w:pBdr>
+          <w:top w:val="single" w:color="46C1C0" w:sz="16"/>
+        </w:pBdr>
+        <w:spacing w:before="40"/>
+      </w:pPr>
+      <w:r>
+        <w:rPr>
+          <w:rFonts w:ascii="Manrope" w:cs="Manrope" w:eastAsia="Manrope" w:hAnsi="Manrope"/>
+          <w:b/>
+          <w:bCs/>
+          <w:color w:val="46C1C0"/>
+          <w:sz w:val="23"/>
+          <w:szCs w:val="23"/>
+        </w:rPr>
+        <w:t xml:space="preserve">↳  </w:t>
+      </w:r>
+      <w:r>
+        <w:rPr>
+          <w:rFonts w:ascii="Manrope" w:cs="Manrope" w:eastAsia="Manrope" w:hAnsi="Manrope"/>
+          <w:b/>
+          <w:bCs/>
+          <w:color w:val="045E62"/>
+          <w:sz w:val="21"/>
+          <w:szCs w:val="21"/>
+        </w:rPr>
+        <w:t xml:space="preserve">Paired with this handout is a detailed normative-data reference for every test we performed, with the full reference ranges so you can see exactly how your numbers compare.</w:t>
       </w:r>
     </w:p>
     <w:p>
@@ -1743,7 +1803,7 @@
     </w:tbl>
     <w:p>
       <w:pPr>
-        <w:spacing w:after="160"/>
+        <w:spacing w:after="200"/>
       </w:pPr>
     </w:p>
     <w:tbl>
@@ -1752,16 +1812,15 @@
         <w:tblBorders>
           <w:top w:val="none" w:color="FFFFFF" w:sz="0"/>
           <w:left w:val="none" w:color="FFFFFF" w:sz="0"/>
-          <w:bottom w:val="none" w:color="FFFFFF" w:sz="0"/>
+          <w:bottom w:val="single" w:color="132232" w:sz="24"/>
           <w:right w:val="none" w:color="FFFFFF" w:sz="0"/>
-          <w:insideH w:val="single" w:color="auto" w:sz="4"/>
-          <w:insideV w:val="single" w:color="auto" w:sz="4"/>
+          <w:insideH w:val="none" w:color="FFFFFF" w:sz="0"/>
+          <w:insideV w:val="none" w:color="FFFFFF" w:sz="0"/>
         </w:tblBorders>
       </w:tblPr>
       <w:tblGrid>
-        <w:gridCol w:w="3200"/>
-        <w:gridCol w:w="3200"/>
-        <w:gridCol w:w="3200"/>
+        <w:gridCol w:w="3800"/>
+        <w:gridCol w:w="5800"/>
       </w:tblGrid>
       <w:tr>
         <w:trPr>
@@ -1772,15 +1831,16 @@
             <w:tcBorders>
               <w:top w:val="none" w:color="FFFFFF" w:sz="0"/>
               <w:left w:val="none" w:color="FFFFFF" w:sz="0"/>
-              <w:bottom w:val="single" w:color="132232" w:sz="24"/>
+              <w:bottom w:val="none" w:color="FFFFFF" w:sz="0"/>
               <w:right w:val="single" w:color="E2E8F0" w:sz="4"/>
             </w:tcBorders>
             <w:tcMar>
-              <w:top w:type="dxa" w:w="240"/>
+              <w:top w:type="dxa" w:w="260"/>
               <w:left w:type="dxa" w:w="0"/>
               <w:bottom w:type="dxa" w:w="280"/>
-              <w:right w:type="dxa" w:w="200"/>
-            </w:tcMar>
+              <w:right w:type="dxa" w:w="360"/>
+            </w:tcMar>
+            <w:vAlign w:val="center"/>
           </w:tcPr>
           <w:p>
             <w:pPr>
@@ -1797,15 +1857,15 @@
                 <w:caps/>
                 <w:color w:val="46C1C0"/>
                 <w:spacing w:val="24"/>
-                <w:sz w:val="15"/>
-                <w:szCs w:val="15"/>
-              </w:rPr>
-              <w:t xml:space="preserve">TIER 1</w:t>
+                <w:sz w:val="16"/>
+                <w:szCs w:val="16"/>
+              </w:rPr>
+              <w:t xml:space="preserve">TIER 3</w:t>
             </w:r>
           </w:p>
           <w:p>
             <w:pPr>
-              <w:spacing w:after="120" w:before="120"/>
+              <w:spacing w:after="80" w:before="120"/>
             </w:pPr>
             <w:r>
               <w:rPr>
@@ -1813,10 +1873,10 @@
                 <w:b/>
                 <w:bCs/>
                 <w:color w:val="132232"/>
-                <w:sz w:val="26"/>
-                <w:szCs w:val="26"/>
-              </w:rPr>
-              <w:t xml:space="preserve">Foundation</w:t>
+                <w:sz w:val="30"/>
+                <w:szCs w:val="30"/>
+              </w:rPr>
+              <w:t xml:space="preserve">Performance</w:t>
             </w:r>
           </w:p>
           <w:p>
@@ -1826,75 +1886,111 @@
                 <w:b/>
                 <w:bCs/>
                 <w:color w:val="132232"/>
-                <w:sz w:val="48"/>
-                <w:szCs w:val="48"/>
-              </w:rPr>
-              <w:t xml:space="preserve">$510</w:t>
-            </w:r>
-          </w:p>
+                <w:sz w:val="56"/>
+                <w:szCs w:val="56"/>
+              </w:rPr>
+              <w:t xml:space="preserve">$860</w:t>
+            </w:r>
+          </w:p>
+          <w:p>
+            <w:r>
+              <w:rPr>
+                <w:rFonts w:ascii="Manrope" w:cs="Manrope" w:eastAsia="Manrope" w:hAnsi="Manrope"/>
+                <w:color w:val="56606E"/>
+                <w:sz w:val="19"/>
+                <w:szCs w:val="19"/>
+              </w:rPr>
+              <w:t xml:space="preserve">$143.33 / week over 6 weeks</w:t>
+            </w:r>
+          </w:p>
+        </w:tc>
+        <w:tc>
+          <w:tcPr>
+            <w:tcBorders>
+              <w:top w:val="none" w:color="FFFFFF" w:sz="0"/>
+              <w:left w:val="none" w:color="FFFFFF" w:sz="0"/>
+              <w:bottom w:val="none" w:color="FFFFFF" w:sz="0"/>
+              <w:right w:val="none" w:color="FFFFFF" w:sz="0"/>
+            </w:tcBorders>
+            <w:tcMar>
+              <w:top w:type="dxa" w:w="260"/>
+              <w:left w:type="dxa" w:w="360"/>
+              <w:bottom w:type="dxa" w:w="280"/>
+              <w:right w:type="dxa" w:w="0"/>
+            </w:tcMar>
+            <w:vAlign w:val="center"/>
+          </w:tcPr>
           <w:p>
             <w:pPr>
-              <w:spacing w:after="120"/>
+              <w:keepLines/>
+              <w:spacing w:after="140"/>
             </w:pPr>
             <w:r>
               <w:rPr>
                 <w:rFonts w:ascii="Manrope" w:cs="Manrope" w:eastAsia="Manrope" w:hAnsi="Manrope"/>
-                <w:color w:val="56606E"/>
+                <w:color w:val="1A2230"/>
+                <w:sz w:val="23"/>
+                <w:szCs w:val="23"/>
+              </w:rPr>
+              <w:t xml:space="preserve">60-min program design, 4 × 45-min weekly 1:1 sessions, and a 30-min reassessment.</w:t>
+            </w:r>
+          </w:p>
+          <w:p>
+            <w:r>
+              <w:rPr>
+                <w:rFonts w:ascii="Manrope" w:cs="Manrope" w:eastAsia="Manrope" w:hAnsi="Manrope"/>
+                <w:b/>
+                <w:bCs/>
+                <w:color w:val="045E62"/>
                 <w:sz w:val="18"/>
                 <w:szCs w:val="18"/>
               </w:rPr>
-              <w:t xml:space="preserve">$85 / week over 6 weeks</w:t>
-            </w:r>
-          </w:p>
-          <w:p>
-            <w:pPr>
-              <w:keepLines/>
-              <w:spacing w:after="120"/>
-            </w:pPr>
-            <w:r>
-              <w:rPr>
-                <w:rFonts w:ascii="Manrope" w:cs="Manrope" w:eastAsia="Manrope" w:hAnsi="Manrope"/>
-                <w:color w:val="1A2230"/>
-                <w:sz w:val="19"/>
-                <w:szCs w:val="19"/>
-              </w:rPr>
-              <w:t xml:space="preserve">60-min program design, 4 group sessions, and a 30-min reassessment.</w:t>
-            </w:r>
-          </w:p>
-          <w:p>
-            <w:pPr>
-              <w:pBdr>
-                <w:top w:val="single" w:color="E2E8F0" w:sz="4"/>
-              </w:pBdr>
-              <w:spacing w:before="80"/>
-            </w:pPr>
-            <w:r>
-              <w:rPr>
-                <w:rFonts w:ascii="Manrope" w:cs="Manrope" w:eastAsia="Manrope" w:hAnsi="Manrope"/>
-                <w:b/>
-                <w:bCs/>
-                <w:color w:val="045E62"/>
-                <w:sz w:val="16"/>
-                <w:szCs w:val="16"/>
-              </w:rPr>
               <w:t xml:space="preserve">↓ Medicare &amp; private health rebates available</w:t>
             </w:r>
           </w:p>
         </w:tc>
-        <w:tc>
-          <w:tcPr>
-            <w:tcBorders>
-              <w:top w:val="none" w:color="FFFFFF" w:sz="0"/>
-              <w:left w:val="none" w:color="FFFFFF" w:sz="0"/>
-              <w:bottom w:val="single" w:color="132232" w:sz="24"/>
+      </w:tr>
+    </w:tbl>
+    <w:p>
+      <w:pPr>
+        <w:spacing w:after="220"/>
+      </w:pPr>
+    </w:p>
+    <w:tbl>
+      <w:tblPr>
+        <w:tblW w:type="pct" w:w="100%"/>
+        <w:tblBorders>
+          <w:top w:val="none" w:color="FFFFFF" w:sz="0"/>
+          <w:left w:val="none" w:color="FFFFFF" w:sz="0"/>
+          <w:bottom w:val="single" w:color="132232" w:sz="24"/>
+          <w:right w:val="none" w:color="FFFFFF" w:sz="0"/>
+          <w:insideH w:val="none" w:color="FFFFFF" w:sz="0"/>
+          <w:insideV w:val="none" w:color="FFFFFF" w:sz="0"/>
+        </w:tblBorders>
+      </w:tblPr>
+      <w:tblGrid>
+        <w:gridCol w:w="3800"/>
+        <w:gridCol w:w="5800"/>
+      </w:tblGrid>
+      <w:tr>
+        <w:trPr>
+          <w:cantSplit/>
+        </w:trPr>
+        <w:tc>
+          <w:tcPr>
+            <w:tcBorders>
+              <w:top w:val="none" w:color="FFFFFF" w:sz="0"/>
+              <w:left w:val="none" w:color="FFFFFF" w:sz="0"/>
+              <w:bottom w:val="none" w:color="FFFFFF" w:sz="0"/>
               <w:right w:val="single" w:color="E2E8F0" w:sz="4"/>
             </w:tcBorders>
             <w:tcMar>
-              <w:top w:type="dxa" w:w="240"/>
-              <w:left w:type="dxa" w:w="200"/>
+              <w:top w:type="dxa" w:w="260"/>
+              <w:left w:type="dxa" w:w="0"/>
               <w:bottom w:type="dxa" w:w="280"/>
-              <w:right w:type="dxa" w:w="200"/>
-            </w:tcMar>
+              <w:right w:type="dxa" w:w="360"/>
+            </w:tcMar>
+            <w:vAlign w:val="center"/>
           </w:tcPr>
           <w:p>
             <w:pPr>
@@ -1911,15 +2007,15 @@
                 <w:caps/>
                 <w:color w:val="46C1C0"/>
                 <w:spacing w:val="24"/>
-                <w:sz w:val="15"/>
-                <w:szCs w:val="15"/>
+                <w:sz w:val="16"/>
+                <w:szCs w:val="16"/>
               </w:rPr>
               <w:t xml:space="preserve">TIER 2</w:t>
             </w:r>
           </w:p>
           <w:p>
             <w:pPr>
-              <w:spacing w:after="120" w:before="120"/>
+              <w:spacing w:after="80" w:before="120"/>
             </w:pPr>
             <w:r>
               <w:rPr>
@@ -1927,8 +2023,8 @@
                 <w:b/>
                 <w:bCs/>
                 <w:color w:val="132232"/>
-                <w:sz w:val="26"/>
-                <w:szCs w:val="26"/>
+                <w:sz w:val="30"/>
+                <w:szCs w:val="30"/>
               </w:rPr>
               <w:t xml:space="preserve">Progress</w:t>
             </w:r>
@@ -1940,75 +2036,111 @@
                 <w:b/>
                 <w:bCs/>
                 <w:color w:val="132232"/>
-                <w:sz w:val="48"/>
-                <w:szCs w:val="48"/>
+                <w:sz w:val="56"/>
+                <w:szCs w:val="56"/>
               </w:rPr>
               <w:t xml:space="preserve">$680</w:t>
             </w:r>
           </w:p>
           <w:p>
+            <w:r>
+              <w:rPr>
+                <w:rFonts w:ascii="Manrope" w:cs="Manrope" w:eastAsia="Manrope" w:hAnsi="Manrope"/>
+                <w:color w:val="56606E"/>
+                <w:sz w:val="19"/>
+                <w:szCs w:val="19"/>
+              </w:rPr>
+              <w:t xml:space="preserve">$113.33 / week over 6 weeks</w:t>
+            </w:r>
+          </w:p>
+        </w:tc>
+        <w:tc>
+          <w:tcPr>
+            <w:tcBorders>
+              <w:top w:val="none" w:color="FFFFFF" w:sz="0"/>
+              <w:left w:val="none" w:color="FFFFFF" w:sz="0"/>
+              <w:bottom w:val="none" w:color="FFFFFF" w:sz="0"/>
+              <w:right w:val="none" w:color="FFFFFF" w:sz="0"/>
+            </w:tcBorders>
+            <w:tcMar>
+              <w:top w:type="dxa" w:w="260"/>
+              <w:left w:type="dxa" w:w="360"/>
+              <w:bottom w:type="dxa" w:w="280"/>
+              <w:right w:type="dxa" w:w="0"/>
+            </w:tcMar>
+            <w:vAlign w:val="center"/>
+          </w:tcPr>
+          <w:p>
             <w:pPr>
-              <w:spacing w:after="120"/>
+              <w:keepLines/>
+              <w:spacing w:after="140"/>
             </w:pPr>
             <w:r>
               <w:rPr>
                 <w:rFonts w:ascii="Manrope" w:cs="Manrope" w:eastAsia="Manrope" w:hAnsi="Manrope"/>
-                <w:color w:val="56606E"/>
+                <w:color w:val="1A2230"/>
+                <w:sz w:val="23"/>
+                <w:szCs w:val="23"/>
+              </w:rPr>
+              <w:t xml:space="preserve">60-min program design, 4 × 30-min weekly 1:1 sessions, and a 30-min reassessment.</w:t>
+            </w:r>
+          </w:p>
+          <w:p>
+            <w:r>
+              <w:rPr>
+                <w:rFonts w:ascii="Manrope" w:cs="Manrope" w:eastAsia="Manrope" w:hAnsi="Manrope"/>
+                <w:b/>
+                <w:bCs/>
+                <w:color w:val="045E62"/>
                 <w:sz w:val="18"/>
                 <w:szCs w:val="18"/>
               </w:rPr>
-              <w:t xml:space="preserve">$113.33 / week over 6 weeks</w:t>
-            </w:r>
-          </w:p>
-          <w:p>
-            <w:pPr>
-              <w:keepLines/>
-              <w:spacing w:after="120"/>
-            </w:pPr>
-            <w:r>
-              <w:rPr>
-                <w:rFonts w:ascii="Manrope" w:cs="Manrope" w:eastAsia="Manrope" w:hAnsi="Manrope"/>
-                <w:color w:val="1A2230"/>
-                <w:sz w:val="19"/>
-                <w:szCs w:val="19"/>
-              </w:rPr>
-              <w:t xml:space="preserve">60-min program design, 4 × 30-min weekly 1:1 sessions, and a 30-min reassessment.</w:t>
-            </w:r>
-          </w:p>
-          <w:p>
-            <w:pPr>
-              <w:pBdr>
-                <w:top w:val="single" w:color="E2E8F0" w:sz="4"/>
-              </w:pBdr>
-              <w:spacing w:before="80"/>
-            </w:pPr>
-            <w:r>
-              <w:rPr>
-                <w:rFonts w:ascii="Manrope" w:cs="Manrope" w:eastAsia="Manrope" w:hAnsi="Manrope"/>
-                <w:b/>
-                <w:bCs/>
-                <w:color w:val="045E62"/>
-                <w:sz w:val="16"/>
-                <w:szCs w:val="16"/>
-              </w:rPr>
               <w:t xml:space="preserve">↓ Medicare &amp; private health rebates available</w:t>
             </w:r>
           </w:p>
         </w:tc>
-        <w:tc>
-          <w:tcPr>
-            <w:tcBorders>
-              <w:top w:val="none" w:color="FFFFFF" w:sz="0"/>
-              <w:left w:val="none" w:color="FFFFFF" w:sz="0"/>
-              <w:bottom w:val="single" w:color="132232" w:sz="24"/>
-              <w:right w:val="none" w:color="FFFFFF" w:sz="0"/>
-            </w:tcBorders>
-            <w:tcMar>
-              <w:top w:type="dxa" w:w="240"/>
-              <w:left w:type="dxa" w:w="200"/>
+      </w:tr>
+    </w:tbl>
+    <w:p>
+      <w:pPr>
+        <w:spacing w:after="220"/>
+      </w:pPr>
+    </w:p>
+    <w:tbl>
+      <w:tblPr>
+        <w:tblW w:type="pct" w:w="100%"/>
+        <w:tblBorders>
+          <w:top w:val="none" w:color="FFFFFF" w:sz="0"/>
+          <w:left w:val="none" w:color="FFFFFF" w:sz="0"/>
+          <w:bottom w:val="single" w:color="132232" w:sz="24"/>
+          <w:right w:val="none" w:color="FFFFFF" w:sz="0"/>
+          <w:insideH w:val="none" w:color="FFFFFF" w:sz="0"/>
+          <w:insideV w:val="none" w:color="FFFFFF" w:sz="0"/>
+        </w:tblBorders>
+      </w:tblPr>
+      <w:tblGrid>
+        <w:gridCol w:w="3800"/>
+        <w:gridCol w:w="5800"/>
+      </w:tblGrid>
+      <w:tr>
+        <w:trPr>
+          <w:cantSplit/>
+        </w:trPr>
+        <w:tc>
+          <w:tcPr>
+            <w:tcBorders>
+              <w:top w:val="none" w:color="FFFFFF" w:sz="0"/>
+              <w:left w:val="none" w:color="FFFFFF" w:sz="0"/>
+              <w:bottom w:val="none" w:color="FFFFFF" w:sz="0"/>
+              <w:right w:val="single" w:color="E2E8F0" w:sz="4"/>
+            </w:tcBorders>
+            <w:tcMar>
+              <w:top w:type="dxa" w:w="260"/>
+              <w:left w:type="dxa" w:w="0"/>
               <w:bottom w:type="dxa" w:w="280"/>
-              <w:right w:type="dxa" w:w="0"/>
-            </w:tcMar>
+              <w:right w:type="dxa" w:w="360"/>
+            </w:tcMar>
+            <w:vAlign w:val="center"/>
           </w:tcPr>
           <w:p>
             <w:pPr>
@@ -2025,15 +2157,15 @@
                 <w:caps/>
                 <w:color w:val="46C1C0"/>
                 <w:spacing w:val="24"/>
-                <w:sz w:val="15"/>
-                <w:szCs w:val="15"/>
-              </w:rPr>
-              <w:t xml:space="preserve">TIER 3</w:t>
+                <w:sz w:val="16"/>
+                <w:szCs w:val="16"/>
+              </w:rPr>
+              <w:t xml:space="preserve">TIER 1</w:t>
             </w:r>
           </w:p>
           <w:p>
             <w:pPr>
-              <w:spacing w:after="120" w:before="120"/>
+              <w:spacing w:after="80" w:before="120"/>
             </w:pPr>
             <w:r>
               <w:rPr>
@@ -2041,10 +2173,10 @@
                 <w:b/>
                 <w:bCs/>
                 <w:color w:val="132232"/>
-                <w:sz w:val="26"/>
-                <w:szCs w:val="26"/>
-              </w:rPr>
-              <w:t xml:space="preserve">Performance</w:t>
+                <w:sz w:val="30"/>
+                <w:szCs w:val="30"/>
+              </w:rPr>
+              <w:t xml:space="preserve">Foundation</w:t>
             </w:r>
           </w:p>
           <w:p>
@@ -2054,56 +2186,64 @@
                 <w:b/>
                 <w:bCs/>
                 <w:color w:val="132232"/>
-                <w:sz w:val="48"/>
-                <w:szCs w:val="48"/>
-              </w:rPr>
-              <w:t xml:space="preserve">$860</w:t>
-            </w:r>
-          </w:p>
+                <w:sz w:val="56"/>
+                <w:szCs w:val="56"/>
+              </w:rPr>
+              <w:t xml:space="preserve">$510</w:t>
+            </w:r>
+          </w:p>
+          <w:p>
+            <w:r>
+              <w:rPr>
+                <w:rFonts w:ascii="Manrope" w:cs="Manrope" w:eastAsia="Manrope" w:hAnsi="Manrope"/>
+                <w:color w:val="56606E"/>
+                <w:sz w:val="19"/>
+                <w:szCs w:val="19"/>
+              </w:rPr>
+              <w:t xml:space="preserve">$85 / week over 6 weeks</w:t>
+            </w:r>
+          </w:p>
+        </w:tc>
+        <w:tc>
+          <w:tcPr>
+            <w:tcBorders>
+              <w:top w:val="none" w:color="FFFFFF" w:sz="0"/>
+              <w:left w:val="none" w:color="FFFFFF" w:sz="0"/>
+              <w:bottom w:val="none" w:color="FFFFFF" w:sz="0"/>
+              <w:right w:val="none" w:color="FFFFFF" w:sz="0"/>
+            </w:tcBorders>
+            <w:tcMar>
+              <w:top w:type="dxa" w:w="260"/>
+              <w:left w:type="dxa" w:w="360"/>
+              <w:bottom w:type="dxa" w:w="280"/>
+              <w:right w:type="dxa" w:w="0"/>
+            </w:tcMar>
+            <w:vAlign w:val="center"/>
+          </w:tcPr>
           <w:p>
             <w:pPr>
-              <w:spacing w:after="120"/>
+              <w:keepLines/>
+              <w:spacing w:after="140"/>
             </w:pPr>
             <w:r>
               <w:rPr>
                 <w:rFonts w:ascii="Manrope" w:cs="Manrope" w:eastAsia="Manrope" w:hAnsi="Manrope"/>
-                <w:color w:val="56606E"/>
+                <w:color w:val="1A2230"/>
+                <w:sz w:val="23"/>
+                <w:szCs w:val="23"/>
+              </w:rPr>
+              <w:t xml:space="preserve">60-min program design, 4 group sessions, and a 30-min reassessment.</w:t>
+            </w:r>
+          </w:p>
+          <w:p>
+            <w:r>
+              <w:rPr>
+                <w:rFonts w:ascii="Manrope" w:cs="Manrope" w:eastAsia="Manrope" w:hAnsi="Manrope"/>
+                <w:b/>
+                <w:bCs/>
+                <w:color w:val="045E62"/>
                 <w:sz w:val="18"/>
                 <w:szCs w:val="18"/>
-              </w:rPr>
-              <w:t xml:space="preserve">$143.33 / week over 6 weeks</w:t>
-            </w:r>
-          </w:p>
-          <w:p>
-            <w:pPr>
-              <w:keepLines/>
-              <w:spacing w:after="120"/>
-            </w:pPr>
-            <w:r>
-              <w:rPr>
-                <w:rFonts w:ascii="Manrope" w:cs="Manrope" w:eastAsia="Manrope" w:hAnsi="Manrope"/>
-                <w:color w:val="1A2230"/>
-                <w:sz w:val="19"/>
-                <w:szCs w:val="19"/>
-              </w:rPr>
-              <w:t xml:space="preserve">60-min program design, 4 × 45-min weekly 1:1 sessions, and a 30-min reassessment.</w:t>
-            </w:r>
-          </w:p>
-          <w:p>
-            <w:pPr>
-              <w:pBdr>
-                <w:top w:val="single" w:color="E2E8F0" w:sz="4"/>
-              </w:pBdr>
-              <w:spacing w:before="80"/>
-            </w:pPr>
-            <w:r>
-              <w:rPr>
-                <w:rFonts w:ascii="Manrope" w:cs="Manrope" w:eastAsia="Manrope" w:hAnsi="Manrope"/>
-                <w:b/>
-                <w:bCs/>
-                <w:color w:val="045E62"/>
-                <w:sz w:val="16"/>
-                <w:szCs w:val="16"/>
               </w:rPr>
               <w:t xml:space="preserve">↓ Medicare &amp; private health rebates available</w:t>
             </w:r>

</xml_diff>

<commit_message>
scribe: bullet-point page 1 sections + tidy results explainer
- page 1 sections 1-4 now render as bulleted lists: LLM emits "- "
  bullets, docx service splits into arrays, template loops them
- simplify "What Your Results Mean" to one summarising paragraph
- drop the incorrect patient-facing normative-data callout

Co-Authored-By: Claude Opus 4.7 <noreply@anthropic.com>
</commit_message>
<xml_diff>
--- a/backend/assets/Handout_Template.docx
+++ b/backend/assets/Handout_Template.docx
@@ -382,8 +382,22 @@
             </w:r>
           </w:p>
           <w:p>
+            <w:r>
+              <w:rPr>
+                <w:rFonts w:ascii="Manrope" w:cs="Manrope" w:eastAsia="Manrope" w:hAnsi="Manrope"/>
+              </w:rPr>
+              <w:t xml:space="preserve">{{#whats_going_on}}</w:t>
+            </w:r>
+          </w:p>
+          <w:p>
             <w:pPr>
+              <w:pStyle w:val="ListParagraph"/>
               <w:keepLines/>
+              <w:numPr>
+                <w:ilvl w:val="0"/>
+                <w:numId w:val="1"/>
+              </w:numPr>
+              <w:spacing w:after="100"/>
             </w:pPr>
             <w:r>
               <w:rPr>
@@ -392,7 +406,15 @@
                 <w:sz w:val="23"/>
                 <w:szCs w:val="23"/>
               </w:rPr>
-              <w:t xml:space="preserve">{{whats_going_on}}</w:t>
+              <w:t xml:space="preserve">{{.}}</w:t>
+            </w:r>
+          </w:p>
+          <w:p>
+            <w:r>
+              <w:rPr>
+                <w:rFonts w:ascii="Manrope" w:cs="Manrope" w:eastAsia="Manrope" w:hAnsi="Manrope"/>
+              </w:rPr>
+              <w:t xml:space="preserve">{{/whats_going_on}}</w:t>
             </w:r>
           </w:p>
         </w:tc>
@@ -481,8 +503,22 @@
             </w:r>
           </w:p>
           <w:p>
+            <w:r>
+              <w:rPr>
+                <w:rFonts w:ascii="Manrope" w:cs="Manrope" w:eastAsia="Manrope" w:hAnsi="Manrope"/>
+              </w:rPr>
+              <w:t xml:space="preserve">{{#our_aims}}</w:t>
+            </w:r>
+          </w:p>
+          <w:p>
             <w:pPr>
+              <w:pStyle w:val="ListParagraph"/>
               <w:keepLines/>
+              <w:numPr>
+                <w:ilvl w:val="0"/>
+                <w:numId w:val="1"/>
+              </w:numPr>
+              <w:spacing w:after="100"/>
             </w:pPr>
             <w:r>
               <w:rPr>
@@ -491,7 +527,15 @@
                 <w:sz w:val="23"/>
                 <w:szCs w:val="23"/>
               </w:rPr>
-              <w:t xml:space="preserve">{{our_aims}}</w:t>
+              <w:t xml:space="preserve">{{.}}</w:t>
+            </w:r>
+          </w:p>
+          <w:p>
+            <w:r>
+              <w:rPr>
+                <w:rFonts w:ascii="Manrope" w:cs="Manrope" w:eastAsia="Manrope" w:hAnsi="Manrope"/>
+              </w:rPr>
+              <w:t xml:space="preserve">{{/our_aims}}</w:t>
             </w:r>
           </w:p>
         </w:tc>
@@ -580,8 +624,22 @@
             </w:r>
           </w:p>
           <w:p>
+            <w:r>
+              <w:rPr>
+                <w:rFonts w:ascii="Manrope" w:cs="Manrope" w:eastAsia="Manrope" w:hAnsi="Manrope"/>
+              </w:rPr>
+              <w:t xml:space="preserve">{{#how_we_get_there}}</w:t>
+            </w:r>
+          </w:p>
+          <w:p>
             <w:pPr>
+              <w:pStyle w:val="ListParagraph"/>
               <w:keepLines/>
+              <w:numPr>
+                <w:ilvl w:val="0"/>
+                <w:numId w:val="1"/>
+              </w:numPr>
+              <w:spacing w:after="100"/>
             </w:pPr>
             <w:r>
               <w:rPr>
@@ -590,7 +648,15 @@
                 <w:sz w:val="23"/>
                 <w:szCs w:val="23"/>
               </w:rPr>
-              <w:t xml:space="preserve">{{how_we_get_there}}</w:t>
+              <w:t xml:space="preserve">{{.}}</w:t>
+            </w:r>
+          </w:p>
+          <w:p>
+            <w:r>
+              <w:rPr>
+                <w:rFonts w:ascii="Manrope" w:cs="Manrope" w:eastAsia="Manrope" w:hAnsi="Manrope"/>
+              </w:rPr>
+              <w:t xml:space="preserve">{{/how_we_get_there}}</w:t>
             </w:r>
           </w:p>
           <w:p>
@@ -699,8 +765,22 @@
             </w:r>
           </w:p>
           <w:p>
+            <w:r>
+              <w:rPr>
+                <w:rFonts w:ascii="Manrope" w:cs="Manrope" w:eastAsia="Manrope" w:hAnsi="Manrope"/>
+              </w:rPr>
+              <w:t xml:space="preserve">{{#what_to_expect}}</w:t>
+            </w:r>
+          </w:p>
+          <w:p>
             <w:pPr>
+              <w:pStyle w:val="ListParagraph"/>
               <w:keepLines/>
+              <w:numPr>
+                <w:ilvl w:val="0"/>
+                <w:numId w:val="1"/>
+              </w:numPr>
+              <w:spacing w:after="100"/>
             </w:pPr>
             <w:r>
               <w:rPr>
@@ -709,7 +789,15 @@
                 <w:sz w:val="23"/>
                 <w:szCs w:val="23"/>
               </w:rPr>
-              <w:t xml:space="preserve">{{what_to_expect}}</w:t>
+              <w:t xml:space="preserve">{{.}}</w:t>
+            </w:r>
+          </w:p>
+          <w:p>
+            <w:r>
+              <w:rPr>
+                <w:rFonts w:ascii="Manrope" w:cs="Manrope" w:eastAsia="Manrope" w:hAnsi="Manrope"/>
+              </w:rPr>
+              <w:t xml:space="preserve">{{/what_to_expect}}</w:t>
             </w:r>
           </w:p>
         </w:tc>
@@ -1288,19 +1376,7 @@
     <w:p>
       <w:pPr>
         <w:keepLines/>
-        <w:spacing w:after="200"/>
       </w:pPr>
-      <w:r>
-        <w:rPr>
-          <w:rFonts w:ascii="Manrope" w:cs="Manrope" w:eastAsia="Manrope" w:hAnsi="Manrope"/>
-          <w:b/>
-          <w:bCs/>
-          <w:color w:val="132232"/>
-          <w:sz w:val="23"/>
-          <w:szCs w:val="23"/>
-        </w:rPr>
-        <w:t xml:space="preserve">Reading the table. </w:t>
-      </w:r>
       <w:r>
         <w:rPr>
           <w:rFonts w:ascii="Manrope" w:cs="Manrope" w:eastAsia="Manrope" w:hAnsi="Manrope"/>
@@ -1308,110 +1384,7 @@
           <w:sz w:val="23"/>
           <w:szCs w:val="23"/>
         </w:rPr>
-        <w:t xml:space="preserve">Each test is compared against </w:t>
-      </w:r>
-      <w:r>
-        <w:rPr>
-          <w:rFonts w:ascii="Manrope" w:cs="Manrope" w:eastAsia="Manrope" w:hAnsi="Manrope"/>
-          <w:b/>
-          <w:bCs/>
-          <w:color w:val="132232"/>
-          <w:sz w:val="23"/>
-          <w:szCs w:val="23"/>
-        </w:rPr>
-        <w:t xml:space="preserve">normative data</w:t>
-      </w:r>
-      <w:r>
-        <w:rPr>
-          <w:rFonts w:ascii="Manrope" w:cs="Manrope" w:eastAsia="Manrope" w:hAnsi="Manrope"/>
-          <w:color w:val="1A2230"/>
-          <w:sz w:val="23"/>
-          <w:szCs w:val="23"/>
-        </w:rPr>
-        <w:t xml:space="preserve"> — large reference datasets that describe the typical range for someone of your age, sex, and activity level. Your result is read relative to that range, so it tells us not just a raw number but where you sit among people like you. Where a value falls within the expected range, it is a strength we will protect and build on; where it falls below, it is an opportunity area your program is built to target.</w:t>
-      </w:r>
-    </w:p>
-    <w:p>
-      <w:pPr>
-        <w:keepLines/>
-        <w:spacing w:after="200"/>
-      </w:pPr>
-      <w:r>
-        <w:rPr>
-          <w:rFonts w:ascii="Manrope" w:cs="Manrope" w:eastAsia="Manrope" w:hAnsi="Manrope"/>
-          <w:b/>
-          <w:bCs/>
-          <w:color w:val="132232"/>
-          <w:sz w:val="23"/>
-          <w:szCs w:val="23"/>
-        </w:rPr>
-        <w:t xml:space="preserve">We read patterns, not single numbers. </w:t>
-      </w:r>
-      <w:r>
-        <w:rPr>
-          <w:rFonts w:ascii="Manrope" w:cs="Manrope" w:eastAsia="Manrope" w:hAnsi="Manrope"/>
-          <w:color w:val="1A2230"/>
-          <w:sz w:val="23"/>
-          <w:szCs w:val="23"/>
-        </w:rPr>
-        <w:t xml:space="preserve">One result rarely tells the whole story. We look across the tests together — for example, how your strength, mobility, and balance relate to one another — because it is the pattern that explains your symptoms and points to the most effective starting point. A score outside the usual range is never a cause for alarm; it is simply where we begin.</w:t>
-      </w:r>
-    </w:p>
-    <w:p>
-      <w:pPr>
-        <w:keepLines/>
-        <w:spacing w:after="200"/>
-      </w:pPr>
-      <w:r>
-        <w:rPr>
-          <w:rFonts w:ascii="Manrope" w:cs="Manrope" w:eastAsia="Manrope" w:hAnsi="Manrope"/>
-          <w:b/>
-          <w:bCs/>
-          <w:color w:val="132232"/>
-          <w:sz w:val="23"/>
-          <w:szCs w:val="23"/>
-        </w:rPr>
-        <w:t xml:space="preserve">How this shapes your program. </w:t>
-      </w:r>
-      <w:r>
-        <w:rPr>
-          <w:rFonts w:ascii="Manrope" w:cs="Manrope" w:eastAsia="Manrope" w:hAnsi="Manrope"/>
-          <w:color w:val="1A2230"/>
-          <w:sz w:val="23"/>
-          <w:szCs w:val="23"/>
-        </w:rPr>
-        <w:t xml:space="preserve">These results set your baseline and directly calibrate your plan — the exercises we select, the loads we start at, and how quickly we progress are all chosen from where you are today. We repeat the same tests at your reassessment so the change is measured objectively, in black and white, rather than by feel alone.</w:t>
-      </w:r>
-    </w:p>
-    <w:p>
-      <w:pPr>
-        <w:keepLines/>
-        <w:pBdr>
-          <w:top w:val="single" w:color="46C1C0" w:sz="16"/>
-        </w:pBdr>
-        <w:spacing w:before="40"/>
-      </w:pPr>
-      <w:r>
-        <w:rPr>
-          <w:rFonts w:ascii="Manrope" w:cs="Manrope" w:eastAsia="Manrope" w:hAnsi="Manrope"/>
-          <w:b/>
-          <w:bCs/>
-          <w:color w:val="46C1C0"/>
-          <w:sz w:val="23"/>
-          <w:szCs w:val="23"/>
-        </w:rPr>
-        <w:t xml:space="preserve">↳  </w:t>
-      </w:r>
-      <w:r>
-        <w:rPr>
-          <w:rFonts w:ascii="Manrope" w:cs="Manrope" w:eastAsia="Manrope" w:hAnsi="Manrope"/>
-          <w:b/>
-          <w:bCs/>
-          <w:color w:val="045E62"/>
-          <w:sz w:val="21"/>
-          <w:szCs w:val="21"/>
-        </w:rPr>
-        <w:t xml:space="preserve">Paired with this handout is a detailed normative-data reference for every test we performed, with the full reference ranges so you can see exactly how your numbers compare.</w:t>
+        <w:t xml:space="preserve">Each result above is compared against the typical range for someone of your age, sex, and activity level, which is why the interpretation column matters more than the raw number on its own — it tells us where you sit relative to people like you. Where a value sits within the expected range it is a strength we will protect; where it sits below, it is simply where we begin, and it directly shapes the exercises we choose and the loads we start at. None of these numbers is a verdict, and we repeat the same tests at your reassessment so your progress is measured objectively rather than by feel alone.</w:t>
       </w:r>
     </w:p>
     <w:p>

</xml_diff>

<commit_message>
scribe: list tier inclusions as bullet points
Each treatment tier now shows its full inclusions as dot points (program
design, 1:1 sessions, reassessment, gym access, Moveify app, ongoing support)
instead of a single sentence — clearer and stronger for conversion.

Co-Authored-By: Claude Opus 4.7 <noreply@anthropic.com>
</commit_message>
<xml_diff>
--- a/backend/assets/Handout_Template.docx
+++ b/backend/assets/Handout_Template.docx
@@ -1886,29 +1886,137 @@
               <w:right w:val="none" w:color="FFFFFF" w:sz="0"/>
             </w:tcBorders>
             <w:tcMar>
-              <w:top w:type="dxa" w:w="260"/>
+              <w:top w:type="dxa" w:w="240"/>
               <w:left w:type="dxa" w:w="360"/>
-              <w:bottom w:type="dxa" w:w="280"/>
+              <w:bottom w:type="dxa" w:w="260"/>
               <w:right w:type="dxa" w:w="0"/>
             </w:tcMar>
             <w:vAlign w:val="center"/>
           </w:tcPr>
           <w:p>
             <w:pPr>
+              <w:pStyle w:val="ListParagraph"/>
               <w:keepLines/>
-              <w:spacing w:after="140"/>
+              <w:numPr>
+                <w:ilvl w:val="0"/>
+                <w:numId w:val="1"/>
+              </w:numPr>
+              <w:spacing w:after="40"/>
             </w:pPr>
             <w:r>
               <w:rPr>
                 <w:rFonts w:ascii="Manrope" w:cs="Manrope" w:eastAsia="Manrope" w:hAnsi="Manrope"/>
                 <w:color w:val="1A2230"/>
-                <w:sz w:val="23"/>
-                <w:szCs w:val="23"/>
-              </w:rPr>
-              <w:t xml:space="preserve">60-min program design, 4 × 45-min weekly 1:1 sessions, and a 30-min reassessment.</w:t>
-            </w:r>
-          </w:p>
-          <w:p>
+                <w:sz w:val="20"/>
+                <w:szCs w:val="20"/>
+              </w:rPr>
+              <w:t xml:space="preserve">60-min 1:1 program design</w:t>
+            </w:r>
+          </w:p>
+          <w:p>
+            <w:pPr>
+              <w:pStyle w:val="ListParagraph"/>
+              <w:keepLines/>
+              <w:numPr>
+                <w:ilvl w:val="0"/>
+                <w:numId w:val="1"/>
+              </w:numPr>
+              <w:spacing w:after="40"/>
+            </w:pPr>
+            <w:r>
+              <w:rPr>
+                <w:rFonts w:ascii="Manrope" w:cs="Manrope" w:eastAsia="Manrope" w:hAnsi="Manrope"/>
+                <w:color w:val="1A2230"/>
+                <w:sz w:val="20"/>
+                <w:szCs w:val="20"/>
+              </w:rPr>
+              <w:t xml:space="preserve">4 × 45-min weekly 1:1 sessions</w:t>
+            </w:r>
+          </w:p>
+          <w:p>
+            <w:pPr>
+              <w:pStyle w:val="ListParagraph"/>
+              <w:keepLines/>
+              <w:numPr>
+                <w:ilvl w:val="0"/>
+                <w:numId w:val="1"/>
+              </w:numPr>
+              <w:spacing w:after="40"/>
+            </w:pPr>
+            <w:r>
+              <w:rPr>
+                <w:rFonts w:ascii="Manrope" w:cs="Manrope" w:eastAsia="Manrope" w:hAnsi="Manrope"/>
+                <w:color w:val="1A2230"/>
+                <w:sz w:val="20"/>
+                <w:szCs w:val="20"/>
+              </w:rPr>
+              <w:t xml:space="preserve">30-min reassessment</w:t>
+            </w:r>
+          </w:p>
+          <w:p>
+            <w:pPr>
+              <w:pStyle w:val="ListParagraph"/>
+              <w:keepLines/>
+              <w:numPr>
+                <w:ilvl w:val="0"/>
+                <w:numId w:val="1"/>
+              </w:numPr>
+              <w:spacing w:after="40"/>
+            </w:pPr>
+            <w:r>
+              <w:rPr>
+                <w:rFonts w:ascii="Manrope" w:cs="Manrope" w:eastAsia="Manrope" w:hAnsi="Manrope"/>
+                <w:color w:val="1A2230"/>
+                <w:sz w:val="20"/>
+                <w:szCs w:val="20"/>
+              </w:rPr>
+              <w:t xml:space="preserve">Unlimited gym access</w:t>
+            </w:r>
+          </w:p>
+          <w:p>
+            <w:pPr>
+              <w:pStyle w:val="ListParagraph"/>
+              <w:keepLines/>
+              <w:numPr>
+                <w:ilvl w:val="0"/>
+                <w:numId w:val="1"/>
+              </w:numPr>
+              <w:spacing w:after="40"/>
+            </w:pPr>
+            <w:r>
+              <w:rPr>
+                <w:rFonts w:ascii="Manrope" w:cs="Manrope" w:eastAsia="Manrope" w:hAnsi="Manrope"/>
+                <w:color w:val="1A2230"/>
+                <w:sz w:val="20"/>
+                <w:szCs w:val="20"/>
+              </w:rPr>
+              <w:t xml:space="preserve">Moveify app access</w:t>
+            </w:r>
+          </w:p>
+          <w:p>
+            <w:pPr>
+              <w:pStyle w:val="ListParagraph"/>
+              <w:keepLines/>
+              <w:numPr>
+                <w:ilvl w:val="0"/>
+                <w:numId w:val="1"/>
+              </w:numPr>
+              <w:spacing w:after="40"/>
+            </w:pPr>
+            <w:r>
+              <w:rPr>
+                <w:rFonts w:ascii="Manrope" w:cs="Manrope" w:eastAsia="Manrope" w:hAnsi="Manrope"/>
+                <w:color w:val="1A2230"/>
+                <w:sz w:val="20"/>
+                <w:szCs w:val="20"/>
+              </w:rPr>
+              <w:t xml:space="preserve">Ongoing support</w:t>
+            </w:r>
+          </w:p>
+          <w:p>
+            <w:pPr>
+              <w:spacing w:before="120"/>
+            </w:pPr>
             <w:r>
               <w:rPr>
                 <w:rFonts w:ascii="Manrope" w:cs="Manrope" w:eastAsia="Manrope" w:hAnsi="Manrope"/>
@@ -2036,29 +2144,137 @@
               <w:right w:val="none" w:color="FFFFFF" w:sz="0"/>
             </w:tcBorders>
             <w:tcMar>
-              <w:top w:type="dxa" w:w="260"/>
+              <w:top w:type="dxa" w:w="240"/>
               <w:left w:type="dxa" w:w="360"/>
-              <w:bottom w:type="dxa" w:w="280"/>
+              <w:bottom w:type="dxa" w:w="260"/>
               <w:right w:type="dxa" w:w="0"/>
             </w:tcMar>
             <w:vAlign w:val="center"/>
           </w:tcPr>
           <w:p>
             <w:pPr>
+              <w:pStyle w:val="ListParagraph"/>
               <w:keepLines/>
-              <w:spacing w:after="140"/>
+              <w:numPr>
+                <w:ilvl w:val="0"/>
+                <w:numId w:val="1"/>
+              </w:numPr>
+              <w:spacing w:after="40"/>
             </w:pPr>
             <w:r>
               <w:rPr>
                 <w:rFonts w:ascii="Manrope" w:cs="Manrope" w:eastAsia="Manrope" w:hAnsi="Manrope"/>
                 <w:color w:val="1A2230"/>
-                <w:sz w:val="23"/>
-                <w:szCs w:val="23"/>
-              </w:rPr>
-              <w:t xml:space="preserve">60-min program design, 4 × 30-min weekly 1:1 sessions, and a 30-min reassessment.</w:t>
-            </w:r>
-          </w:p>
-          <w:p>
+                <w:sz w:val="20"/>
+                <w:szCs w:val="20"/>
+              </w:rPr>
+              <w:t xml:space="preserve">60-min 1:1 program design</w:t>
+            </w:r>
+          </w:p>
+          <w:p>
+            <w:pPr>
+              <w:pStyle w:val="ListParagraph"/>
+              <w:keepLines/>
+              <w:numPr>
+                <w:ilvl w:val="0"/>
+                <w:numId w:val="1"/>
+              </w:numPr>
+              <w:spacing w:after="40"/>
+            </w:pPr>
+            <w:r>
+              <w:rPr>
+                <w:rFonts w:ascii="Manrope" w:cs="Manrope" w:eastAsia="Manrope" w:hAnsi="Manrope"/>
+                <w:color w:val="1A2230"/>
+                <w:sz w:val="20"/>
+                <w:szCs w:val="20"/>
+              </w:rPr>
+              <w:t xml:space="preserve">4 × 30-min weekly 1:1 sessions</w:t>
+            </w:r>
+          </w:p>
+          <w:p>
+            <w:pPr>
+              <w:pStyle w:val="ListParagraph"/>
+              <w:keepLines/>
+              <w:numPr>
+                <w:ilvl w:val="0"/>
+                <w:numId w:val="1"/>
+              </w:numPr>
+              <w:spacing w:after="40"/>
+            </w:pPr>
+            <w:r>
+              <w:rPr>
+                <w:rFonts w:ascii="Manrope" w:cs="Manrope" w:eastAsia="Manrope" w:hAnsi="Manrope"/>
+                <w:color w:val="1A2230"/>
+                <w:sz w:val="20"/>
+                <w:szCs w:val="20"/>
+              </w:rPr>
+              <w:t xml:space="preserve">30-min reassessment</w:t>
+            </w:r>
+          </w:p>
+          <w:p>
+            <w:pPr>
+              <w:pStyle w:val="ListParagraph"/>
+              <w:keepLines/>
+              <w:numPr>
+                <w:ilvl w:val="0"/>
+                <w:numId w:val="1"/>
+              </w:numPr>
+              <w:spacing w:after="40"/>
+            </w:pPr>
+            <w:r>
+              <w:rPr>
+                <w:rFonts w:ascii="Manrope" w:cs="Manrope" w:eastAsia="Manrope" w:hAnsi="Manrope"/>
+                <w:color w:val="1A2230"/>
+                <w:sz w:val="20"/>
+                <w:szCs w:val="20"/>
+              </w:rPr>
+              <w:t xml:space="preserve">Unlimited gym access</w:t>
+            </w:r>
+          </w:p>
+          <w:p>
+            <w:pPr>
+              <w:pStyle w:val="ListParagraph"/>
+              <w:keepLines/>
+              <w:numPr>
+                <w:ilvl w:val="0"/>
+                <w:numId w:val="1"/>
+              </w:numPr>
+              <w:spacing w:after="40"/>
+            </w:pPr>
+            <w:r>
+              <w:rPr>
+                <w:rFonts w:ascii="Manrope" w:cs="Manrope" w:eastAsia="Manrope" w:hAnsi="Manrope"/>
+                <w:color w:val="1A2230"/>
+                <w:sz w:val="20"/>
+                <w:szCs w:val="20"/>
+              </w:rPr>
+              <w:t xml:space="preserve">Moveify app access</w:t>
+            </w:r>
+          </w:p>
+          <w:p>
+            <w:pPr>
+              <w:pStyle w:val="ListParagraph"/>
+              <w:keepLines/>
+              <w:numPr>
+                <w:ilvl w:val="0"/>
+                <w:numId w:val="1"/>
+              </w:numPr>
+              <w:spacing w:after="40"/>
+            </w:pPr>
+            <w:r>
+              <w:rPr>
+                <w:rFonts w:ascii="Manrope" w:cs="Manrope" w:eastAsia="Manrope" w:hAnsi="Manrope"/>
+                <w:color w:val="1A2230"/>
+                <w:sz w:val="20"/>
+                <w:szCs w:val="20"/>
+              </w:rPr>
+              <w:t xml:space="preserve">Ongoing support</w:t>
+            </w:r>
+          </w:p>
+          <w:p>
+            <w:pPr>
+              <w:spacing w:before="120"/>
+            </w:pPr>
             <w:r>
               <w:rPr>
                 <w:rFonts w:ascii="Manrope" w:cs="Manrope" w:eastAsia="Manrope" w:hAnsi="Manrope"/>
@@ -2186,29 +2402,137 @@
               <w:right w:val="none" w:color="FFFFFF" w:sz="0"/>
             </w:tcBorders>
             <w:tcMar>
-              <w:top w:type="dxa" w:w="260"/>
+              <w:top w:type="dxa" w:w="240"/>
               <w:left w:type="dxa" w:w="360"/>
-              <w:bottom w:type="dxa" w:w="280"/>
+              <w:bottom w:type="dxa" w:w="260"/>
               <w:right w:type="dxa" w:w="0"/>
             </w:tcMar>
             <w:vAlign w:val="center"/>
           </w:tcPr>
           <w:p>
             <w:pPr>
+              <w:pStyle w:val="ListParagraph"/>
               <w:keepLines/>
-              <w:spacing w:after="140"/>
+              <w:numPr>
+                <w:ilvl w:val="0"/>
+                <w:numId w:val="1"/>
+              </w:numPr>
+              <w:spacing w:after="40"/>
             </w:pPr>
             <w:r>
               <w:rPr>
                 <w:rFonts w:ascii="Manrope" w:cs="Manrope" w:eastAsia="Manrope" w:hAnsi="Manrope"/>
                 <w:color w:val="1A2230"/>
-                <w:sz w:val="23"/>
-                <w:szCs w:val="23"/>
-              </w:rPr>
-              <w:t xml:space="preserve">60-min program design, 4 group sessions, and a 30-min reassessment.</w:t>
-            </w:r>
-          </w:p>
-          <w:p>
+                <w:sz w:val="20"/>
+                <w:szCs w:val="20"/>
+              </w:rPr>
+              <w:t xml:space="preserve">60-min 1:1 program design</w:t>
+            </w:r>
+          </w:p>
+          <w:p>
+            <w:pPr>
+              <w:pStyle w:val="ListParagraph"/>
+              <w:keepLines/>
+              <w:numPr>
+                <w:ilvl w:val="0"/>
+                <w:numId w:val="1"/>
+              </w:numPr>
+              <w:spacing w:after="40"/>
+            </w:pPr>
+            <w:r>
+              <w:rPr>
+                <w:rFonts w:ascii="Manrope" w:cs="Manrope" w:eastAsia="Manrope" w:hAnsi="Manrope"/>
+                <w:color w:val="1A2230"/>
+                <w:sz w:val="20"/>
+                <w:szCs w:val="20"/>
+              </w:rPr>
+              <w:t xml:space="preserve">4 × group sessions</w:t>
+            </w:r>
+          </w:p>
+          <w:p>
+            <w:pPr>
+              <w:pStyle w:val="ListParagraph"/>
+              <w:keepLines/>
+              <w:numPr>
+                <w:ilvl w:val="0"/>
+                <w:numId w:val="1"/>
+              </w:numPr>
+              <w:spacing w:after="40"/>
+            </w:pPr>
+            <w:r>
+              <w:rPr>
+                <w:rFonts w:ascii="Manrope" w:cs="Manrope" w:eastAsia="Manrope" w:hAnsi="Manrope"/>
+                <w:color w:val="1A2230"/>
+                <w:sz w:val="20"/>
+                <w:szCs w:val="20"/>
+              </w:rPr>
+              <w:t xml:space="preserve">30-min reassessment</w:t>
+            </w:r>
+          </w:p>
+          <w:p>
+            <w:pPr>
+              <w:pStyle w:val="ListParagraph"/>
+              <w:keepLines/>
+              <w:numPr>
+                <w:ilvl w:val="0"/>
+                <w:numId w:val="1"/>
+              </w:numPr>
+              <w:spacing w:after="40"/>
+            </w:pPr>
+            <w:r>
+              <w:rPr>
+                <w:rFonts w:ascii="Manrope" w:cs="Manrope" w:eastAsia="Manrope" w:hAnsi="Manrope"/>
+                <w:color w:val="1A2230"/>
+                <w:sz w:val="20"/>
+                <w:szCs w:val="20"/>
+              </w:rPr>
+              <w:t xml:space="preserve">Unlimited gym access</w:t>
+            </w:r>
+          </w:p>
+          <w:p>
+            <w:pPr>
+              <w:pStyle w:val="ListParagraph"/>
+              <w:keepLines/>
+              <w:numPr>
+                <w:ilvl w:val="0"/>
+                <w:numId w:val="1"/>
+              </w:numPr>
+              <w:spacing w:after="40"/>
+            </w:pPr>
+            <w:r>
+              <w:rPr>
+                <w:rFonts w:ascii="Manrope" w:cs="Manrope" w:eastAsia="Manrope" w:hAnsi="Manrope"/>
+                <w:color w:val="1A2230"/>
+                <w:sz w:val="20"/>
+                <w:szCs w:val="20"/>
+              </w:rPr>
+              <w:t xml:space="preserve">Moveify app access</w:t>
+            </w:r>
+          </w:p>
+          <w:p>
+            <w:pPr>
+              <w:pStyle w:val="ListParagraph"/>
+              <w:keepLines/>
+              <w:numPr>
+                <w:ilvl w:val="0"/>
+                <w:numId w:val="1"/>
+              </w:numPr>
+              <w:spacing w:after="40"/>
+            </w:pPr>
+            <w:r>
+              <w:rPr>
+                <w:rFonts w:ascii="Manrope" w:cs="Manrope" w:eastAsia="Manrope" w:hAnsi="Manrope"/>
+                <w:color w:val="1A2230"/>
+                <w:sz w:val="20"/>
+                <w:szCs w:val="20"/>
+              </w:rPr>
+              <w:t xml:space="preserve">Ongoing support</w:t>
+            </w:r>
+          </w:p>
+          <w:p>
+            <w:pPr>
+              <w:spacing w:before="120"/>
+            </w:pPr>
             <w:r>
               <w:rPr>
                 <w:rFonts w:ascii="Manrope" w:cs="Manrope" w:eastAsia="Manrope" w:hAnsi="Manrope"/>

</xml_diff>

<commit_message>
scribe: lead tier pricing with the weekly figure
Sales-psychology framing: hero the weekly price (feels more affordable via
payment partitioning), with the total and pay-in-full (-5%) price beneath for
transparency. Drop the now-redundant pay-in-full / gym+app line from the intro.

Co-Authored-By: Claude Opus 4.7 <noreply@anthropic.com>
</commit_message>
<xml_diff>
--- a/backend/assets/Handout_Template.docx
+++ b/backend/assets/Handout_Template.docx
@@ -1723,7 +1723,7 @@
           <w:sz w:val="23"/>
           <w:szCs w:val="23"/>
         </w:rPr>
-        <w:t xml:space="preserve">Payment is weekly direct debit over 6 weeks, or pay in full with a 5% discount. Every tier includes unlimited gym access and the Moveify app. The clinical program is the same across all three — the tiers differ in how much 1:1 support and supervision you receive.</w:t>
+        <w:t xml:space="preserve">Payment is a weekly direct debit over 6 weeks. The clinical program is the same across all three tiers — they differ in how much 1:1 support and supervision you receive.</w:t>
       </w:r>
     </w:p>
     <w:tbl>
@@ -1838,7 +1838,7 @@
           </w:p>
           <w:p>
             <w:pPr>
-              <w:spacing w:after="80" w:before="120"/>
+              <w:spacing w:after="100" w:before="120"/>
             </w:pPr>
             <w:r>
               <w:rPr>
@@ -1862,18 +1862,71 @@
                 <w:sz w:val="56"/>
                 <w:szCs w:val="56"/>
               </w:rPr>
-              <w:t xml:space="preserve">$860</w:t>
-            </w:r>
-          </w:p>
-          <w:p>
+              <w:t xml:space="preserve">$143.33</w:t>
+            </w:r>
+          </w:p>
+          <w:p>
+            <w:pPr>
+              <w:spacing w:after="100"/>
+            </w:pPr>
             <w:r>
               <w:rPr>
                 <w:rFonts w:ascii="Manrope" w:cs="Manrope" w:eastAsia="Manrope" w:hAnsi="Manrope"/>
                 <w:color w:val="56606E"/>
-                <w:sz w:val="19"/>
-                <w:szCs w:val="19"/>
-              </w:rPr>
-              <w:t xml:space="preserve">$143.33 / week over 6 weeks</w:t>
+                <w:sz w:val="18"/>
+                <w:szCs w:val="18"/>
+              </w:rPr>
+              <w:t xml:space="preserve">per week · 6-week direct debit</w:t>
+            </w:r>
+          </w:p>
+          <w:p>
+            <w:pPr>
+              <w:pBdr>
+                <w:top w:val="single" w:color="E2E8F0" w:sz="4"/>
+              </w:pBdr>
+              <w:spacing w:before="80"/>
+            </w:pPr>
+            <w:r>
+              <w:rPr>
+                <w:rFonts w:ascii="Manrope" w:cs="Manrope" w:eastAsia="Manrope" w:hAnsi="Manrope"/>
+                <w:b/>
+                <w:bCs/>
+                <w:color w:val="132232"/>
+                <w:sz w:val="18"/>
+                <w:szCs w:val="18"/>
+              </w:rPr>
+              <w:t xml:space="preserve">$860 total</w:t>
+            </w:r>
+            <w:r>
+              <w:rPr>
+                <w:rFonts w:ascii="Manrope" w:cs="Manrope" w:eastAsia="Manrope" w:hAnsi="Manrope"/>
+                <w:b/>
+                <w:bCs/>
+                <w:color w:val="46C1C0"/>
+                <w:sz w:val="18"/>
+                <w:szCs w:val="18"/>
+              </w:rPr>
+              <w:t xml:space="preserve">  ·  </w:t>
+            </w:r>
+            <w:r>
+              <w:rPr>
+                <w:rFonts w:ascii="Manrope" w:cs="Manrope" w:eastAsia="Manrope" w:hAnsi="Manrope"/>
+                <w:color w:val="1A2230"/>
+                <w:sz w:val="18"/>
+                <w:szCs w:val="18"/>
+              </w:rPr>
+              <w:t xml:space="preserve">or $817 paid in full </w:t>
+            </w:r>
+            <w:r>
+              <w:rPr>
+                <w:rFonts w:ascii="Manrope" w:cs="Manrope" w:eastAsia="Manrope" w:hAnsi="Manrope"/>
+                <w:b/>
+                <w:bCs/>
+                <w:color w:val="045E62"/>
+                <w:sz w:val="18"/>
+                <w:szCs w:val="18"/>
+              </w:rPr>
+              <w:t xml:space="preserve">(save 5%)</w:t>
             </w:r>
           </w:p>
         </w:tc>
@@ -2096,7 +2149,7 @@
           </w:p>
           <w:p>
             <w:pPr>
-              <w:spacing w:after="80" w:before="120"/>
+              <w:spacing w:after="100" w:before="120"/>
             </w:pPr>
             <w:r>
               <w:rPr>
@@ -2120,18 +2173,71 @@
                 <w:sz w:val="56"/>
                 <w:szCs w:val="56"/>
               </w:rPr>
-              <w:t xml:space="preserve">$680</w:t>
-            </w:r>
-          </w:p>
-          <w:p>
+              <w:t xml:space="preserve">$113.33</w:t>
+            </w:r>
+          </w:p>
+          <w:p>
+            <w:pPr>
+              <w:spacing w:after="100"/>
+            </w:pPr>
             <w:r>
               <w:rPr>
                 <w:rFonts w:ascii="Manrope" w:cs="Manrope" w:eastAsia="Manrope" w:hAnsi="Manrope"/>
                 <w:color w:val="56606E"/>
-                <w:sz w:val="19"/>
-                <w:szCs w:val="19"/>
-              </w:rPr>
-              <w:t xml:space="preserve">$113.33 / week over 6 weeks</w:t>
+                <w:sz w:val="18"/>
+                <w:szCs w:val="18"/>
+              </w:rPr>
+              <w:t xml:space="preserve">per week · 6-week direct debit</w:t>
+            </w:r>
+          </w:p>
+          <w:p>
+            <w:pPr>
+              <w:pBdr>
+                <w:top w:val="single" w:color="E2E8F0" w:sz="4"/>
+              </w:pBdr>
+              <w:spacing w:before="80"/>
+            </w:pPr>
+            <w:r>
+              <w:rPr>
+                <w:rFonts w:ascii="Manrope" w:cs="Manrope" w:eastAsia="Manrope" w:hAnsi="Manrope"/>
+                <w:b/>
+                <w:bCs/>
+                <w:color w:val="132232"/>
+                <w:sz w:val="18"/>
+                <w:szCs w:val="18"/>
+              </w:rPr>
+              <w:t xml:space="preserve">$680 total</w:t>
+            </w:r>
+            <w:r>
+              <w:rPr>
+                <w:rFonts w:ascii="Manrope" w:cs="Manrope" w:eastAsia="Manrope" w:hAnsi="Manrope"/>
+                <w:b/>
+                <w:bCs/>
+                <w:color w:val="46C1C0"/>
+                <w:sz w:val="18"/>
+                <w:szCs w:val="18"/>
+              </w:rPr>
+              <w:t xml:space="preserve">  ·  </w:t>
+            </w:r>
+            <w:r>
+              <w:rPr>
+                <w:rFonts w:ascii="Manrope" w:cs="Manrope" w:eastAsia="Manrope" w:hAnsi="Manrope"/>
+                <w:color w:val="1A2230"/>
+                <w:sz w:val="18"/>
+                <w:szCs w:val="18"/>
+              </w:rPr>
+              <w:t xml:space="preserve">or $646 paid in full </w:t>
+            </w:r>
+            <w:r>
+              <w:rPr>
+                <w:rFonts w:ascii="Manrope" w:cs="Manrope" w:eastAsia="Manrope" w:hAnsi="Manrope"/>
+                <w:b/>
+                <w:bCs/>
+                <w:color w:val="045E62"/>
+                <w:sz w:val="18"/>
+                <w:szCs w:val="18"/>
+              </w:rPr>
+              <w:t xml:space="preserve">(save 5%)</w:t>
             </w:r>
           </w:p>
         </w:tc>
@@ -2354,7 +2460,7 @@
           </w:p>
           <w:p>
             <w:pPr>
-              <w:spacing w:after="80" w:before="120"/>
+              <w:spacing w:after="100" w:before="120"/>
             </w:pPr>
             <w:r>
               <w:rPr>
@@ -2378,18 +2484,71 @@
                 <w:sz w:val="56"/>
                 <w:szCs w:val="56"/>
               </w:rPr>
-              <w:t xml:space="preserve">$510</w:t>
-            </w:r>
-          </w:p>
-          <w:p>
+              <w:t xml:space="preserve">$85</w:t>
+            </w:r>
+          </w:p>
+          <w:p>
+            <w:pPr>
+              <w:spacing w:after="100"/>
+            </w:pPr>
             <w:r>
               <w:rPr>
                 <w:rFonts w:ascii="Manrope" w:cs="Manrope" w:eastAsia="Manrope" w:hAnsi="Manrope"/>
                 <w:color w:val="56606E"/>
-                <w:sz w:val="19"/>
-                <w:szCs w:val="19"/>
-              </w:rPr>
-              <w:t xml:space="preserve">$85 / week over 6 weeks</w:t>
+                <w:sz w:val="18"/>
+                <w:szCs w:val="18"/>
+              </w:rPr>
+              <w:t xml:space="preserve">per week · 6-week direct debit</w:t>
+            </w:r>
+          </w:p>
+          <w:p>
+            <w:pPr>
+              <w:pBdr>
+                <w:top w:val="single" w:color="E2E8F0" w:sz="4"/>
+              </w:pBdr>
+              <w:spacing w:before="80"/>
+            </w:pPr>
+            <w:r>
+              <w:rPr>
+                <w:rFonts w:ascii="Manrope" w:cs="Manrope" w:eastAsia="Manrope" w:hAnsi="Manrope"/>
+                <w:b/>
+                <w:bCs/>
+                <w:color w:val="132232"/>
+                <w:sz w:val="18"/>
+                <w:szCs w:val="18"/>
+              </w:rPr>
+              <w:t xml:space="preserve">$510 total</w:t>
+            </w:r>
+            <w:r>
+              <w:rPr>
+                <w:rFonts w:ascii="Manrope" w:cs="Manrope" w:eastAsia="Manrope" w:hAnsi="Manrope"/>
+                <w:b/>
+                <w:bCs/>
+                <w:color w:val="46C1C0"/>
+                <w:sz w:val="18"/>
+                <w:szCs w:val="18"/>
+              </w:rPr>
+              <w:t xml:space="preserve">  ·  </w:t>
+            </w:r>
+            <w:r>
+              <w:rPr>
+                <w:rFonts w:ascii="Manrope" w:cs="Manrope" w:eastAsia="Manrope" w:hAnsi="Manrope"/>
+                <w:color w:val="1A2230"/>
+                <w:sz w:val="18"/>
+                <w:szCs w:val="18"/>
+              </w:rPr>
+              <w:t xml:space="preserve">or $484.50 paid in full </w:t>
+            </w:r>
+            <w:r>
+              <w:rPr>
+                <w:rFonts w:ascii="Manrope" w:cs="Manrope" w:eastAsia="Manrope" w:hAnsi="Manrope"/>
+                <w:b/>
+                <w:bCs/>
+                <w:color w:val="045E62"/>
+                <w:sz w:val="18"/>
+                <w:szCs w:val="18"/>
+              </w:rPr>
+              <w:t xml:space="preserve">(save 5%)</w:t>
             </w:r>
           </w:p>
         </w:tc>

</xml_diff>

<commit_message>
Fix Foundation tier price in patient handout ($510 → $460)
The printed handout listed Tier 1 Foundation at $85/week ($510 block,
$484.50 pay-in-full) — the old Pricing Scheme v3.0 figure that was already
corrected to $460 ($76.67/week, $437 PIF) in v3.1. T2/T3 and the live Stripe
agreement were already correct; only the handout carried the stale number.

Regenerated Handout_Template.docx (read at runtime by scribe-handout-docx.js,
so the corrected asset must ship in the backend container). The script change
also carries the pre-existing refactor to shared handout-kit.js helpers.

Co-Authored-By: Claude Opus 4.8 <noreply@anthropic.com>
</commit_message>
<xml_diff>
--- a/backend/assets/Handout_Template.docx
+++ b/backend/assets/Handout_Template.docx
@@ -2484,7 +2484,7 @@
                 <w:sz w:val="56"/>
                 <w:szCs w:val="56"/>
               </w:rPr>
-              <w:t xml:space="preserve">$85</w:t>
+              <w:t xml:space="preserve">$76.67</w:t>
             </w:r>
           </w:p>
           <w:p>
@@ -2517,7 +2517,7 @@
                 <w:sz w:val="18"/>
                 <w:szCs w:val="18"/>
               </w:rPr>
-              <w:t xml:space="preserve">$510 total</w:t>
+              <w:t xml:space="preserve">$460 total</w:t>
             </w:r>
             <w:r>
               <w:rPr>
@@ -2537,7 +2537,7 @@
                 <w:sz w:val="18"/>
                 <w:szCs w:val="18"/>
               </w:rPr>
-              <w:t xml:space="preserve">or $484.50 paid in full </w:t>
+              <w:t xml:space="preserve">or $437 paid in full </w:t>
             </w:r>
             <w:r>
               <w:rPr>

</xml_diff>